<commit_message>
Templates updated to support .NET MAUI 11 Preview & Avalonia backend for .NET MAUI (VSIX) #367 #368 #379
</commit_message>
<xml_diff>
--- a/src/Extensions/MauiTemplates/MauiTemplates/readme.docx
+++ b/src/Extensions/MauiTemplates/MauiTemplates/readme.docx
@@ -91,7 +91,7 @@
           <w:r>
             <w:fldChar w:fldCharType="separate"/>
           </w:r>
-          <w:hyperlink w:anchor="_Toc215221703" w:history="1">
+          <w:hyperlink w:anchor="_Toc225346377" w:history="1">
             <w:r>
               <w:rPr>
                 <w:rStyle w:val="Hyperlink"/>
@@ -119,7 +119,7 @@
                 <w:noProof/>
                 <w:webHidden/>
               </w:rPr>
-              <w:instrText xml:space="preserve"> PAGEREF _Toc215221703 \h </w:instrText>
+              <w:instrText xml:space="preserve"> PAGEREF _Toc225346377 \h </w:instrText>
             </w:r>
             <w:r>
               <w:rPr>
@@ -165,7 +165,7 @@
               <w14:ligatures w14:val="standardContextual"/>
             </w:rPr>
           </w:pPr>
-          <w:hyperlink w:anchor="_Toc215221704" w:history="1">
+          <w:hyperlink w:anchor="_Toc225346378" w:history="1">
             <w:r>
               <w:rPr>
                 <w:rStyle w:val="Hyperlink"/>
@@ -193,7 +193,7 @@
                 <w:noProof/>
                 <w:webHidden/>
               </w:rPr>
-              <w:instrText xml:space="preserve"> PAGEREF _Toc215221704 \h </w:instrText>
+              <w:instrText xml:space="preserve"> PAGEREF _Toc225346378 \h </w:instrText>
             </w:r>
             <w:r>
               <w:rPr>
@@ -239,7 +239,7 @@
               <w14:ligatures w14:val="standardContextual"/>
             </w:rPr>
           </w:pPr>
-          <w:hyperlink w:anchor="_Toc215221705" w:history="1">
+          <w:hyperlink w:anchor="_Toc225346379" w:history="1">
             <w:r>
               <w:rPr>
                 <w:rStyle w:val="Hyperlink"/>
@@ -267,7 +267,7 @@
                 <w:noProof/>
                 <w:webHidden/>
               </w:rPr>
-              <w:instrText xml:space="preserve"> PAGEREF _Toc215221705 \h </w:instrText>
+              <w:instrText xml:space="preserve"> PAGEREF _Toc225346379 \h </w:instrText>
             </w:r>
             <w:r>
               <w:rPr>
@@ -313,7 +313,7 @@
               <w14:ligatures w14:val="standardContextual"/>
             </w:rPr>
           </w:pPr>
-          <w:hyperlink w:anchor="_Toc215221706" w:history="1">
+          <w:hyperlink w:anchor="_Toc225346380" w:history="1">
             <w:r>
               <w:rPr>
                 <w:rStyle w:val="Hyperlink"/>
@@ -341,7 +341,7 @@
                 <w:noProof/>
                 <w:webHidden/>
               </w:rPr>
-              <w:instrText xml:space="preserve"> PAGEREF _Toc215221706 \h </w:instrText>
+              <w:instrText xml:space="preserve"> PAGEREF _Toc225346380 \h </w:instrText>
             </w:r>
             <w:r>
               <w:rPr>
@@ -387,7 +387,7 @@
               <w14:ligatures w14:val="standardContextual"/>
             </w:rPr>
           </w:pPr>
-          <w:hyperlink w:anchor="_Toc215221707" w:history="1">
+          <w:hyperlink w:anchor="_Toc225346381" w:history="1">
             <w:r>
               <w:rPr>
                 <w:rStyle w:val="Hyperlink"/>
@@ -422,7 +422,7 @@
                 <w:noProof/>
                 <w:webHidden/>
               </w:rPr>
-              <w:instrText xml:space="preserve"> PAGEREF _Toc215221707 \h </w:instrText>
+              <w:instrText xml:space="preserve"> PAGEREF _Toc225346381 \h </w:instrText>
             </w:r>
             <w:r>
               <w:rPr>
@@ -468,7 +468,7 @@
               <w14:ligatures w14:val="standardContextual"/>
             </w:rPr>
           </w:pPr>
-          <w:hyperlink w:anchor="_Toc215221708" w:history="1">
+          <w:hyperlink w:anchor="_Toc225346382" w:history="1">
             <w:r>
               <w:rPr>
                 <w:rStyle w:val="Hyperlink"/>
@@ -496,7 +496,7 @@
                 <w:noProof/>
                 <w:webHidden/>
               </w:rPr>
-              <w:instrText xml:space="preserve"> PAGEREF _Toc215221708 \h </w:instrText>
+              <w:instrText xml:space="preserve"> PAGEREF _Toc225346382 \h </w:instrText>
             </w:r>
             <w:r>
               <w:rPr>
@@ -542,7 +542,7 @@
               <w14:ligatures w14:val="standardContextual"/>
             </w:rPr>
           </w:pPr>
-          <w:hyperlink w:anchor="_Toc215221709" w:history="1">
+          <w:hyperlink w:anchor="_Toc225346383" w:history="1">
             <w:r>
               <w:rPr>
                 <w:rStyle w:val="Hyperlink"/>
@@ -570,7 +570,7 @@
                 <w:noProof/>
                 <w:webHidden/>
               </w:rPr>
-              <w:instrText xml:space="preserve"> PAGEREF _Toc215221709 \h </w:instrText>
+              <w:instrText xml:space="preserve"> PAGEREF _Toc225346383 \h </w:instrText>
             </w:r>
             <w:r>
               <w:rPr>
@@ -657,7 +657,7 @@
           <w:lang w:val="en"/>
         </w:rPr>
       </w:pPr>
-      <w:bookmarkStart w:id="0" w:name="_Toc215221703"/>
+      <w:bookmarkStart w:id="0" w:name="_Toc225346377"/>
       <w:r>
         <w:rPr>
           <w:lang w:val="en"/>
@@ -799,7 +799,7 @@
           <w:lang w:val="en"/>
         </w:rPr>
       </w:pPr>
-      <w:bookmarkStart w:id="1" w:name="_Toc215221704"/>
+      <w:bookmarkStart w:id="1" w:name="_Toc225346378"/>
       <w:r>
         <w:rPr>
           <w:lang w:val="en"/>
@@ -999,7 +999,7 @@
           <w:lang w:val="en"/>
         </w:rPr>
       </w:pPr>
-      <w:bookmarkStart w:id="2" w:name="_Toc215221705"/>
+      <w:bookmarkStart w:id="2" w:name="_Toc225346379"/>
       <w:r>
         <w:rPr>
           <w:lang w:val="en"/>
@@ -1402,8 +1402,18 @@
           <w:szCs w:val="22"/>
           <w:lang w:val="en"/>
         </w:rPr>
-        <w:t>Content Page with BlazorWebView</w:t>
-      </w:r>
+        <w:t xml:space="preserve">Content Page with </w:t>
+      </w:r>
+      <w:proofErr w:type="spellStart"/>
+      <w:r>
+        <w:rPr>
+          <w:rFonts w:ascii="Calibri" w:hAnsi="Calibri" w:cs="Calibri"/>
+          <w:szCs w:val="22"/>
+          <w:lang w:val="en"/>
+        </w:rPr>
+        <w:t>BlazorWebView</w:t>
+      </w:r>
+      <w:proofErr w:type="spellEnd"/>
     </w:p>
     <w:p>
       <w:pPr>
@@ -1430,7 +1440,25 @@
           <w:szCs w:val="22"/>
           <w:lang w:val="en"/>
         </w:rPr>
-        <w:t>Content Page with BlazorWebView (C#)</w:t>
+        <w:t xml:space="preserve">Content Page with </w:t>
+      </w:r>
+      <w:proofErr w:type="spellStart"/>
+      <w:r>
+        <w:rPr>
+          <w:rFonts w:ascii="Calibri" w:hAnsi="Calibri" w:cs="Calibri"/>
+          <w:szCs w:val="22"/>
+          <w:lang w:val="en"/>
+        </w:rPr>
+        <w:t>BlazorWebView</w:t>
+      </w:r>
+      <w:proofErr w:type="spellEnd"/>
+      <w:r>
+        <w:rPr>
+          <w:rFonts w:ascii="Calibri" w:hAnsi="Calibri" w:cs="Calibri"/>
+          <w:szCs w:val="22"/>
+          <w:lang w:val="en"/>
+        </w:rPr>
+        <w:t xml:space="preserve"> (C#)</w:t>
       </w:r>
     </w:p>
     <w:p>
@@ -1797,6 +1825,7 @@
           <w:lang w:val="en"/>
         </w:rPr>
       </w:pPr>
+      <w:proofErr w:type="spellStart"/>
       <w:r>
         <w:rPr>
           <w:rFonts w:ascii="Calibri" w:hAnsi="Calibri" w:cs="Calibri"/>
@@ -1807,6 +1836,7 @@
         </w:rPr>
         <w:t>ResourceDictionary</w:t>
       </w:r>
+      <w:proofErr w:type="spellEnd"/>
       <w:r>
         <w:rPr>
           <w:rFonts w:ascii="Calibri" w:hAnsi="Calibri" w:cs="Calibri"/>
@@ -2642,7 +2672,7 @@
           <w:lang w:val="en"/>
         </w:rPr>
       </w:pPr>
-      <w:bookmarkStart w:id="3" w:name="_Toc215221706"/>
+      <w:bookmarkStart w:id="3" w:name="_Toc225346380"/>
       <w:r>
         <w:rPr>
           <w:lang w:val="en"/>
@@ -2665,7 +2695,7 @@
           <w:lang w:val="en"/>
         </w:rPr>
       </w:pPr>
-      <w:bookmarkStart w:id="4" w:name="_Toc215221707"/>
+      <w:bookmarkStart w:id="4" w:name="_Toc225346381"/>
       <w:r>
         <w:t>For</w:t>
       </w:r>
@@ -2801,6 +2831,7 @@
         </w:rPr>
         <w:t xml:space="preserve"> as a </w:t>
       </w:r>
+      <w:proofErr w:type="spellStart"/>
       <w:r>
         <w:rPr>
           <w:rFonts w:ascii="Calibri" w:hAnsi="Calibri" w:cs="Calibri"/>
@@ -2811,6 +2842,7 @@
         </w:rPr>
         <w:t>SurroundWith</w:t>
       </w:r>
+      <w:proofErr w:type="spellEnd"/>
       <w:r>
         <w:rPr>
           <w:rFonts w:ascii="Calibri" w:hAnsi="Calibri" w:cs="Calibri"/>
@@ -3369,7 +3401,43 @@
                 <w:szCs w:val="22"/>
                 <w:lang w:val="en"/>
               </w:rPr>
-              <w:t>&lt;Grid ColumnDefinitions="" RowDefinitions=""&gt;</w:t>
+              <w:t xml:space="preserve">&lt;Grid </w:t>
+            </w:r>
+            <w:proofErr w:type="spellStart"/>
+            <w:r>
+              <w:rPr>
+                <w:rFonts w:ascii="Calibri" w:hAnsi="Calibri" w:cs="Calibri"/>
+                <w:szCs w:val="22"/>
+                <w:lang w:val="en"/>
+              </w:rPr>
+              <w:t>ColumnDefinitions</w:t>
+            </w:r>
+            <w:proofErr w:type="spellEnd"/>
+            <w:r>
+              <w:rPr>
+                <w:rFonts w:ascii="Calibri" w:hAnsi="Calibri" w:cs="Calibri"/>
+                <w:szCs w:val="22"/>
+                <w:lang w:val="en"/>
+              </w:rPr>
+              <w:t xml:space="preserve">="" </w:t>
+            </w:r>
+            <w:proofErr w:type="spellStart"/>
+            <w:r>
+              <w:rPr>
+                <w:rFonts w:ascii="Calibri" w:hAnsi="Calibri" w:cs="Calibri"/>
+                <w:szCs w:val="22"/>
+                <w:lang w:val="en"/>
+              </w:rPr>
+              <w:t>RowDefinitions</w:t>
+            </w:r>
+            <w:proofErr w:type="spellEnd"/>
+            <w:r>
+              <w:rPr>
+                <w:rFonts w:ascii="Calibri" w:hAnsi="Calibri" w:cs="Calibri"/>
+                <w:szCs w:val="22"/>
+                <w:lang w:val="en"/>
+              </w:rPr>
+              <w:t>=""&gt;</w:t>
             </w:r>
           </w:p>
           <w:p>
@@ -3487,30 +3555,48 @@
                 <w:szCs w:val="22"/>
                 <w:lang w:val="en"/>
               </w:rPr>
-              <w:t>&lt;FlexLayout&gt;</w:t>
-            </w:r>
-          </w:p>
-          <w:p>
-            <w:pPr>
-              <w:widowControl w:val="0"/>
-              <w:autoSpaceDE w:val="0"/>
-              <w:autoSpaceDN w:val="0"/>
-              <w:adjustRightInd w:val="0"/>
-              <w:spacing w:after="200"/>
-              <w:rPr>
-                <w:rFonts w:ascii="Calibri" w:hAnsi="Calibri" w:cs="Calibri"/>
-                <w:szCs w:val="22"/>
-                <w:lang w:val="en"/>
-              </w:rPr>
-            </w:pPr>
-            <w:r>
-              <w:rPr>
-                <w:rFonts w:ascii="Calibri" w:hAnsi="Calibri" w:cs="Calibri"/>
-                <w:szCs w:val="22"/>
-                <w:lang w:val="en"/>
-              </w:rPr>
               <w:t>&lt;</w:t>
             </w:r>
+            <w:proofErr w:type="spellStart"/>
+            <w:r>
+              <w:rPr>
+                <w:rFonts w:ascii="Calibri" w:hAnsi="Calibri" w:cs="Calibri"/>
+                <w:szCs w:val="22"/>
+                <w:lang w:val="en"/>
+              </w:rPr>
+              <w:t>FlexLayout</w:t>
+            </w:r>
+            <w:proofErr w:type="spellEnd"/>
+            <w:r>
+              <w:rPr>
+                <w:rFonts w:ascii="Calibri" w:hAnsi="Calibri" w:cs="Calibri"/>
+                <w:szCs w:val="22"/>
+                <w:lang w:val="en"/>
+              </w:rPr>
+              <w:t>&gt;</w:t>
+            </w:r>
+          </w:p>
+          <w:p>
+            <w:pPr>
+              <w:widowControl w:val="0"/>
+              <w:autoSpaceDE w:val="0"/>
+              <w:autoSpaceDN w:val="0"/>
+              <w:adjustRightInd w:val="0"/>
+              <w:spacing w:after="200"/>
+              <w:rPr>
+                <w:rFonts w:ascii="Calibri" w:hAnsi="Calibri" w:cs="Calibri"/>
+                <w:szCs w:val="22"/>
+                <w:lang w:val="en"/>
+              </w:rPr>
+            </w:pPr>
+            <w:r>
+              <w:rPr>
+                <w:rFonts w:ascii="Calibri" w:hAnsi="Calibri" w:cs="Calibri"/>
+                <w:szCs w:val="22"/>
+                <w:lang w:val="en"/>
+              </w:rPr>
+              <w:t>&lt;</w:t>
+            </w:r>
             <w:r>
               <w:rPr>
                 <w:rFonts w:ascii="Calibri" w:hAnsi="Calibri" w:cs="Calibri"/>
@@ -3519,13 +3605,23 @@
               </w:rPr>
               <w:t>/</w:t>
             </w:r>
-            <w:r>
-              <w:rPr>
-                <w:rFonts w:ascii="Calibri" w:hAnsi="Calibri" w:cs="Calibri"/>
-                <w:szCs w:val="22"/>
-                <w:lang w:val="en"/>
-              </w:rPr>
-              <w:t>FlexLayout&gt;</w:t>
+            <w:proofErr w:type="spellStart"/>
+            <w:r>
+              <w:rPr>
+                <w:rFonts w:ascii="Calibri" w:hAnsi="Calibri" w:cs="Calibri"/>
+                <w:szCs w:val="22"/>
+                <w:lang w:val="en"/>
+              </w:rPr>
+              <w:t>FlexLayout</w:t>
+            </w:r>
+            <w:proofErr w:type="spellEnd"/>
+            <w:r>
+              <w:rPr>
+                <w:rFonts w:ascii="Calibri" w:hAnsi="Calibri" w:cs="Calibri"/>
+                <w:szCs w:val="22"/>
+                <w:lang w:val="en"/>
+              </w:rPr>
+              <w:t>&gt;</w:t>
             </w:r>
           </w:p>
         </w:tc>
@@ -3623,29 +3719,65 @@
                 <w:szCs w:val="22"/>
                 <w:lang w:val="en"/>
               </w:rPr>
-              <w:t>&lt;StackLayout&gt;</w:t>
-            </w:r>
-          </w:p>
-          <w:p>
-            <w:pPr>
-              <w:widowControl w:val="0"/>
-              <w:autoSpaceDE w:val="0"/>
-              <w:autoSpaceDN w:val="0"/>
-              <w:adjustRightInd w:val="0"/>
-              <w:spacing w:after="200"/>
-              <w:rPr>
-                <w:rFonts w:ascii="Calibri" w:hAnsi="Calibri" w:cs="Calibri"/>
-                <w:szCs w:val="22"/>
-                <w:lang w:val="en"/>
-              </w:rPr>
-            </w:pPr>
-            <w:r>
-              <w:rPr>
-                <w:rFonts w:ascii="Calibri" w:hAnsi="Calibri" w:cs="Calibri"/>
-                <w:szCs w:val="22"/>
-                <w:lang w:val="en"/>
-              </w:rPr>
-              <w:t>&lt;/StackLayout&gt;</w:t>
+              <w:t>&lt;</w:t>
+            </w:r>
+            <w:proofErr w:type="spellStart"/>
+            <w:r>
+              <w:rPr>
+                <w:rFonts w:ascii="Calibri" w:hAnsi="Calibri" w:cs="Calibri"/>
+                <w:szCs w:val="22"/>
+                <w:lang w:val="en"/>
+              </w:rPr>
+              <w:t>StackLayout</w:t>
+            </w:r>
+            <w:proofErr w:type="spellEnd"/>
+            <w:r>
+              <w:rPr>
+                <w:rFonts w:ascii="Calibri" w:hAnsi="Calibri" w:cs="Calibri"/>
+                <w:szCs w:val="22"/>
+                <w:lang w:val="en"/>
+              </w:rPr>
+              <w:t>&gt;</w:t>
+            </w:r>
+          </w:p>
+          <w:p>
+            <w:pPr>
+              <w:widowControl w:val="0"/>
+              <w:autoSpaceDE w:val="0"/>
+              <w:autoSpaceDN w:val="0"/>
+              <w:adjustRightInd w:val="0"/>
+              <w:spacing w:after="200"/>
+              <w:rPr>
+                <w:rFonts w:ascii="Calibri" w:hAnsi="Calibri" w:cs="Calibri"/>
+                <w:szCs w:val="22"/>
+                <w:lang w:val="en"/>
+              </w:rPr>
+            </w:pPr>
+            <w:r>
+              <w:rPr>
+                <w:rFonts w:ascii="Calibri" w:hAnsi="Calibri" w:cs="Calibri"/>
+                <w:szCs w:val="22"/>
+                <w:lang w:val="en"/>
+              </w:rPr>
+              <w:t>&lt;/</w:t>
+            </w:r>
+            <w:proofErr w:type="spellStart"/>
+            <w:r>
+              <w:rPr>
+                <w:rFonts w:ascii="Calibri" w:hAnsi="Calibri" w:cs="Calibri"/>
+                <w:szCs w:val="22"/>
+                <w:lang w:val="en"/>
+              </w:rPr>
+              <w:t>StackLayout</w:t>
+            </w:r>
+            <w:proofErr w:type="spellEnd"/>
+            <w:r>
+              <w:rPr>
+                <w:rFonts w:ascii="Calibri" w:hAnsi="Calibri" w:cs="Calibri"/>
+                <w:szCs w:val="22"/>
+                <w:lang w:val="en"/>
+              </w:rPr>
+              <w:t>&gt;</w:t>
             </w:r>
           </w:p>
         </w:tc>
@@ -3708,6 +3840,7 @@
                 <w:lang w:val="en"/>
               </w:rPr>
             </w:pPr>
+            <w:proofErr w:type="spellStart"/>
             <w:r>
               <w:rPr>
                 <w:rFonts w:ascii="Calibri" w:hAnsi="Calibri" w:cs="Calibri"/>
@@ -3718,6 +3851,7 @@
               </w:rPr>
               <w:t>hstack</w:t>
             </w:r>
+            <w:proofErr w:type="spellEnd"/>
           </w:p>
         </w:tc>
         <w:tc>
@@ -3743,30 +3877,48 @@
                 <w:szCs w:val="22"/>
                 <w:lang w:val="en"/>
               </w:rPr>
-              <w:t>&lt;HorizontalStackLayout&gt;</w:t>
-            </w:r>
-          </w:p>
-          <w:p>
-            <w:pPr>
-              <w:widowControl w:val="0"/>
-              <w:autoSpaceDE w:val="0"/>
-              <w:autoSpaceDN w:val="0"/>
-              <w:adjustRightInd w:val="0"/>
-              <w:spacing w:after="200"/>
-              <w:rPr>
-                <w:rFonts w:ascii="Calibri" w:hAnsi="Calibri" w:cs="Calibri"/>
-                <w:szCs w:val="22"/>
-                <w:lang w:val="en"/>
-              </w:rPr>
-            </w:pPr>
-            <w:r>
-              <w:rPr>
-                <w:rFonts w:ascii="Calibri" w:hAnsi="Calibri" w:cs="Calibri"/>
-                <w:szCs w:val="22"/>
-                <w:lang w:val="en"/>
-              </w:rPr>
               <w:t>&lt;</w:t>
             </w:r>
+            <w:proofErr w:type="spellStart"/>
+            <w:r>
+              <w:rPr>
+                <w:rFonts w:ascii="Calibri" w:hAnsi="Calibri" w:cs="Calibri"/>
+                <w:szCs w:val="22"/>
+                <w:lang w:val="en"/>
+              </w:rPr>
+              <w:t>HorizontalStackLayout</w:t>
+            </w:r>
+            <w:proofErr w:type="spellEnd"/>
+            <w:r>
+              <w:rPr>
+                <w:rFonts w:ascii="Calibri" w:hAnsi="Calibri" w:cs="Calibri"/>
+                <w:szCs w:val="22"/>
+                <w:lang w:val="en"/>
+              </w:rPr>
+              <w:t>&gt;</w:t>
+            </w:r>
+          </w:p>
+          <w:p>
+            <w:pPr>
+              <w:widowControl w:val="0"/>
+              <w:autoSpaceDE w:val="0"/>
+              <w:autoSpaceDN w:val="0"/>
+              <w:adjustRightInd w:val="0"/>
+              <w:spacing w:after="200"/>
+              <w:rPr>
+                <w:rFonts w:ascii="Calibri" w:hAnsi="Calibri" w:cs="Calibri"/>
+                <w:szCs w:val="22"/>
+                <w:lang w:val="en"/>
+              </w:rPr>
+            </w:pPr>
+            <w:r>
+              <w:rPr>
+                <w:rFonts w:ascii="Calibri" w:hAnsi="Calibri" w:cs="Calibri"/>
+                <w:szCs w:val="22"/>
+                <w:lang w:val="en"/>
+              </w:rPr>
+              <w:t>&lt;</w:t>
+            </w:r>
             <w:r>
               <w:rPr>
                 <w:rFonts w:ascii="Calibri" w:hAnsi="Calibri" w:cs="Calibri"/>
@@ -3775,13 +3927,23 @@
               </w:rPr>
               <w:t>/</w:t>
             </w:r>
-            <w:r>
-              <w:rPr>
-                <w:rFonts w:ascii="Calibri" w:hAnsi="Calibri" w:cs="Calibri"/>
-                <w:szCs w:val="22"/>
-                <w:lang w:val="en"/>
-              </w:rPr>
-              <w:t>HorizontalStackLayout&gt;</w:t>
+            <w:proofErr w:type="spellStart"/>
+            <w:r>
+              <w:rPr>
+                <w:rFonts w:ascii="Calibri" w:hAnsi="Calibri" w:cs="Calibri"/>
+                <w:szCs w:val="22"/>
+                <w:lang w:val="en"/>
+              </w:rPr>
+              <w:t>HorizontalStackLayout</w:t>
+            </w:r>
+            <w:proofErr w:type="spellEnd"/>
+            <w:r>
+              <w:rPr>
+                <w:rFonts w:ascii="Calibri" w:hAnsi="Calibri" w:cs="Calibri"/>
+                <w:szCs w:val="22"/>
+                <w:lang w:val="en"/>
+              </w:rPr>
+              <w:t>&gt;</w:t>
             </w:r>
           </w:p>
         </w:tc>
@@ -3844,6 +4006,7 @@
                 <w:lang w:val="en"/>
               </w:rPr>
             </w:pPr>
+            <w:proofErr w:type="spellStart"/>
             <w:r>
               <w:rPr>
                 <w:rFonts w:ascii="Calibri" w:hAnsi="Calibri" w:cs="Calibri"/>
@@ -3854,6 +4017,7 @@
               </w:rPr>
               <w:t>vstack</w:t>
             </w:r>
+            <w:proofErr w:type="spellEnd"/>
           </w:p>
         </w:tc>
         <w:tc>
@@ -3879,30 +4043,48 @@
                 <w:szCs w:val="22"/>
                 <w:lang w:val="en"/>
               </w:rPr>
-              <w:t>&lt;VerticalStackLayout&gt;</w:t>
-            </w:r>
-          </w:p>
-          <w:p>
-            <w:pPr>
-              <w:widowControl w:val="0"/>
-              <w:autoSpaceDE w:val="0"/>
-              <w:autoSpaceDN w:val="0"/>
-              <w:adjustRightInd w:val="0"/>
-              <w:spacing w:after="200"/>
-              <w:rPr>
-                <w:rFonts w:ascii="Calibri" w:hAnsi="Calibri" w:cs="Calibri"/>
-                <w:szCs w:val="22"/>
-                <w:lang w:val="en"/>
-              </w:rPr>
-            </w:pPr>
-            <w:r>
-              <w:rPr>
-                <w:rFonts w:ascii="Calibri" w:hAnsi="Calibri" w:cs="Calibri"/>
-                <w:szCs w:val="22"/>
-                <w:lang w:val="en"/>
-              </w:rPr>
               <w:t>&lt;</w:t>
             </w:r>
+            <w:proofErr w:type="spellStart"/>
+            <w:r>
+              <w:rPr>
+                <w:rFonts w:ascii="Calibri" w:hAnsi="Calibri" w:cs="Calibri"/>
+                <w:szCs w:val="22"/>
+                <w:lang w:val="en"/>
+              </w:rPr>
+              <w:t>VerticalStackLayout</w:t>
+            </w:r>
+            <w:proofErr w:type="spellEnd"/>
+            <w:r>
+              <w:rPr>
+                <w:rFonts w:ascii="Calibri" w:hAnsi="Calibri" w:cs="Calibri"/>
+                <w:szCs w:val="22"/>
+                <w:lang w:val="en"/>
+              </w:rPr>
+              <w:t>&gt;</w:t>
+            </w:r>
+          </w:p>
+          <w:p>
+            <w:pPr>
+              <w:widowControl w:val="0"/>
+              <w:autoSpaceDE w:val="0"/>
+              <w:autoSpaceDN w:val="0"/>
+              <w:adjustRightInd w:val="0"/>
+              <w:spacing w:after="200"/>
+              <w:rPr>
+                <w:rFonts w:ascii="Calibri" w:hAnsi="Calibri" w:cs="Calibri"/>
+                <w:szCs w:val="22"/>
+                <w:lang w:val="en"/>
+              </w:rPr>
+            </w:pPr>
+            <w:r>
+              <w:rPr>
+                <w:rFonts w:ascii="Calibri" w:hAnsi="Calibri" w:cs="Calibri"/>
+                <w:szCs w:val="22"/>
+                <w:lang w:val="en"/>
+              </w:rPr>
+              <w:t>&lt;</w:t>
+            </w:r>
             <w:r>
               <w:rPr>
                 <w:rFonts w:ascii="Calibri" w:hAnsi="Calibri" w:cs="Calibri"/>
@@ -3911,13 +4093,23 @@
               </w:rPr>
               <w:t>/</w:t>
             </w:r>
-            <w:r>
-              <w:rPr>
-                <w:rFonts w:ascii="Calibri" w:hAnsi="Calibri" w:cs="Calibri"/>
-                <w:szCs w:val="22"/>
-                <w:lang w:val="en"/>
-              </w:rPr>
-              <w:t>VerticalStackLayout&gt;</w:t>
+            <w:proofErr w:type="spellStart"/>
+            <w:r>
+              <w:rPr>
+                <w:rFonts w:ascii="Calibri" w:hAnsi="Calibri" w:cs="Calibri"/>
+                <w:szCs w:val="22"/>
+                <w:lang w:val="en"/>
+              </w:rPr>
+              <w:t>VerticalStackLayout</w:t>
+            </w:r>
+            <w:proofErr w:type="spellEnd"/>
+            <w:r>
+              <w:rPr>
+                <w:rFonts w:ascii="Calibri" w:hAnsi="Calibri" w:cs="Calibri"/>
+                <w:szCs w:val="22"/>
+                <w:lang w:val="en"/>
+              </w:rPr>
+              <w:t>&gt;</w:t>
             </w:r>
           </w:p>
         </w:tc>
@@ -4011,7 +4203,25 @@
                 <w:szCs w:val="22"/>
                 <w:lang w:val="en"/>
               </w:rPr>
-              <w:t>&lt;Style TargetType="</w:t>
+              <w:t xml:space="preserve">&lt;Style </w:t>
+            </w:r>
+            <w:proofErr w:type="spellStart"/>
+            <w:r>
+              <w:rPr>
+                <w:rFonts w:ascii="Calibri" w:hAnsi="Calibri" w:cs="Calibri"/>
+                <w:szCs w:val="22"/>
+                <w:lang w:val="en"/>
+              </w:rPr>
+              <w:t>TargetType</w:t>
+            </w:r>
+            <w:proofErr w:type="spellEnd"/>
+            <w:r>
+              <w:rPr>
+                <w:rFonts w:ascii="Calibri" w:hAnsi="Calibri" w:cs="Calibri"/>
+                <w:szCs w:val="22"/>
+                <w:lang w:val="en"/>
+              </w:rPr>
+              <w:t>="</w:t>
             </w:r>
             <w:r>
               <w:rPr>
@@ -4266,6 +4476,7 @@
               </w:rPr>
               <w:t>&lt;</w:t>
             </w:r>
+            <w:proofErr w:type="spellStart"/>
             <w:r>
               <w:rPr>
                 <w:rFonts w:ascii="Calibri" w:hAnsi="Calibri" w:cs="Calibri"/>
@@ -4281,29 +4492,16 @@
                 <w:szCs w:val="22"/>
                 <w:lang w:val="en"/>
               </w:rPr>
-              <w:t>.Resources&gt;</w:t>
-            </w:r>
-          </w:p>
-          <w:p>
-            <w:pPr>
-              <w:widowControl w:val="0"/>
-              <w:autoSpaceDE w:val="0"/>
-              <w:autoSpaceDN w:val="0"/>
-              <w:adjustRightInd w:val="0"/>
-              <w:spacing w:after="200"/>
-              <w:rPr>
-                <w:rFonts w:ascii="Calibri" w:hAnsi="Calibri" w:cs="Calibri"/>
-                <w:szCs w:val="22"/>
-                <w:lang w:val="en"/>
-              </w:rPr>
-            </w:pPr>
-            <w:r>
-              <w:rPr>
-                <w:rFonts w:ascii="Calibri" w:hAnsi="Calibri" w:cs="Calibri"/>
-                <w:szCs w:val="22"/>
-                <w:lang w:val="en"/>
-              </w:rPr>
-              <w:t>&lt;ResourceDictionary&gt;</w:t>
+              <w:t>.Resources</w:t>
+            </w:r>
+            <w:proofErr w:type="spellEnd"/>
+            <w:r>
+              <w:rPr>
+                <w:rFonts w:ascii="Calibri" w:hAnsi="Calibri" w:cs="Calibri"/>
+                <w:szCs w:val="22"/>
+                <w:lang w:val="en"/>
+              </w:rPr>
+              <w:t>&gt;</w:t>
             </w:r>
           </w:p>
           <w:p>
@@ -4327,6 +4525,46 @@
               </w:rPr>
               <w:t>&lt;</w:t>
             </w:r>
+            <w:proofErr w:type="spellStart"/>
+            <w:r>
+              <w:rPr>
+                <w:rFonts w:ascii="Calibri" w:hAnsi="Calibri" w:cs="Calibri"/>
+                <w:szCs w:val="22"/>
+                <w:lang w:val="en"/>
+              </w:rPr>
+              <w:t>ResourceDictionary</w:t>
+            </w:r>
+            <w:proofErr w:type="spellEnd"/>
+            <w:r>
+              <w:rPr>
+                <w:rFonts w:ascii="Calibri" w:hAnsi="Calibri" w:cs="Calibri"/>
+                <w:szCs w:val="22"/>
+                <w:lang w:val="en"/>
+              </w:rPr>
+              <w:t>&gt;</w:t>
+            </w:r>
+          </w:p>
+          <w:p>
+            <w:pPr>
+              <w:widowControl w:val="0"/>
+              <w:autoSpaceDE w:val="0"/>
+              <w:autoSpaceDN w:val="0"/>
+              <w:adjustRightInd w:val="0"/>
+              <w:spacing w:after="200"/>
+              <w:rPr>
+                <w:rFonts w:ascii="Calibri" w:hAnsi="Calibri" w:cs="Calibri"/>
+                <w:szCs w:val="22"/>
+                <w:lang w:val="en"/>
+              </w:rPr>
+            </w:pPr>
+            <w:r>
+              <w:rPr>
+                <w:rFonts w:ascii="Calibri" w:hAnsi="Calibri" w:cs="Calibri"/>
+                <w:szCs w:val="22"/>
+                <w:lang w:val="en"/>
+              </w:rPr>
+              <w:t>&lt;</w:t>
+            </w:r>
             <w:r>
               <w:rPr>
                 <w:rFonts w:ascii="Calibri" w:hAnsi="Calibri" w:cs="Calibri"/>
@@ -4335,13 +4573,23 @@
               </w:rPr>
               <w:t>/</w:t>
             </w:r>
-            <w:r>
-              <w:rPr>
-                <w:rFonts w:ascii="Calibri" w:hAnsi="Calibri" w:cs="Calibri"/>
-                <w:szCs w:val="22"/>
-                <w:lang w:val="en"/>
-              </w:rPr>
-              <w:t>ResourceDictionary&gt;</w:t>
+            <w:proofErr w:type="spellStart"/>
+            <w:r>
+              <w:rPr>
+                <w:rFonts w:ascii="Calibri" w:hAnsi="Calibri" w:cs="Calibri"/>
+                <w:szCs w:val="22"/>
+                <w:lang w:val="en"/>
+              </w:rPr>
+              <w:t>ResourceDictionary</w:t>
+            </w:r>
+            <w:proofErr w:type="spellEnd"/>
+            <w:r>
+              <w:rPr>
+                <w:rFonts w:ascii="Calibri" w:hAnsi="Calibri" w:cs="Calibri"/>
+                <w:szCs w:val="22"/>
+                <w:lang w:val="en"/>
+              </w:rPr>
+              <w:t>&gt;</w:t>
             </w:r>
           </w:p>
           <w:p>
@@ -4373,6 +4621,7 @@
               </w:rPr>
               <w:t>/</w:t>
             </w:r>
+            <w:proofErr w:type="spellStart"/>
             <w:r>
               <w:rPr>
                 <w:rFonts w:ascii="Calibri" w:hAnsi="Calibri" w:cs="Calibri"/>
@@ -4388,7 +4637,16 @@
                 <w:szCs w:val="22"/>
                 <w:lang w:val="en"/>
               </w:rPr>
-              <w:t>.Resources&gt;</w:t>
+              <w:t>.Resources</w:t>
+            </w:r>
+            <w:proofErr w:type="spellEnd"/>
+            <w:r>
+              <w:rPr>
+                <w:rFonts w:ascii="Calibri" w:hAnsi="Calibri" w:cs="Calibri"/>
+                <w:szCs w:val="22"/>
+                <w:lang w:val="en"/>
+              </w:rPr>
+              <w:t>&gt;</w:t>
             </w:r>
           </w:p>
         </w:tc>
@@ -4480,6 +4738,7 @@
               </w:rPr>
               <w:t>&lt;</w:t>
             </w:r>
+            <w:proofErr w:type="spellStart"/>
             <w:r>
               <w:rPr>
                 <w:rFonts w:ascii="Calibri" w:hAnsi="Calibri" w:cs="Calibri"/>
@@ -4495,7 +4754,16 @@
                 <w:szCs w:val="22"/>
                 <w:lang w:val="en"/>
               </w:rPr>
-              <w:t>.GestureRecognizers&gt;</w:t>
+              <w:t>.GestureRecognizers</w:t>
+            </w:r>
+            <w:proofErr w:type="spellEnd"/>
+            <w:r>
+              <w:rPr>
+                <w:rFonts w:ascii="Calibri" w:hAnsi="Calibri" w:cs="Calibri"/>
+                <w:szCs w:val="22"/>
+                <w:lang w:val="en"/>
+              </w:rPr>
+              <w:t>&gt;</w:t>
             </w:r>
           </w:p>
           <w:p>
@@ -4527,6 +4795,7 @@
               </w:rPr>
               <w:t>/</w:t>
             </w:r>
+            <w:proofErr w:type="spellStart"/>
             <w:r>
               <w:rPr>
                 <w:rFonts w:ascii="Calibri" w:hAnsi="Calibri" w:cs="Calibri"/>
@@ -4542,7 +4811,16 @@
                 <w:szCs w:val="22"/>
                 <w:lang w:val="en"/>
               </w:rPr>
-              <w:t>.GestureRecognizers&gt;</w:t>
+              <w:t>.GestureRecognizers</w:t>
+            </w:r>
+            <w:proofErr w:type="spellEnd"/>
+            <w:r>
+              <w:rPr>
+                <w:rFonts w:ascii="Calibri" w:hAnsi="Calibri" w:cs="Calibri"/>
+                <w:szCs w:val="22"/>
+                <w:lang w:val="en"/>
+              </w:rPr>
+              <w:t>&gt;</w:t>
             </w:r>
           </w:p>
         </w:tc>
@@ -4632,7 +4910,25 @@
                 <w:szCs w:val="22"/>
                 <w:lang w:val="en"/>
               </w:rPr>
-              <w:t>&lt;TapGestureRecognizer /&gt;</w:t>
+              <w:t>&lt;</w:t>
+            </w:r>
+            <w:proofErr w:type="spellStart"/>
+            <w:r>
+              <w:rPr>
+                <w:rFonts w:ascii="Calibri" w:hAnsi="Calibri" w:cs="Calibri"/>
+                <w:szCs w:val="22"/>
+                <w:lang w:val="en"/>
+              </w:rPr>
+              <w:t>TapGestureRecognizer</w:t>
+            </w:r>
+            <w:proofErr w:type="spellEnd"/>
+            <w:r>
+              <w:rPr>
+                <w:rFonts w:ascii="Calibri" w:hAnsi="Calibri" w:cs="Calibri"/>
+                <w:szCs w:val="22"/>
+                <w:lang w:val="en"/>
+              </w:rPr>
+              <w:t xml:space="preserve"> /&gt;</w:t>
             </w:r>
           </w:p>
         </w:tc>
@@ -4722,7 +5018,25 @@
                 <w:szCs w:val="22"/>
                 <w:lang w:val="en"/>
               </w:rPr>
-              <w:t>&lt;DragGestureRecognizer /&gt;</w:t>
+              <w:t>&lt;</w:t>
+            </w:r>
+            <w:proofErr w:type="spellStart"/>
+            <w:r>
+              <w:rPr>
+                <w:rFonts w:ascii="Calibri" w:hAnsi="Calibri" w:cs="Calibri"/>
+                <w:szCs w:val="22"/>
+                <w:lang w:val="en"/>
+              </w:rPr>
+              <w:t>DragGestureRecognizer</w:t>
+            </w:r>
+            <w:proofErr w:type="spellEnd"/>
+            <w:r>
+              <w:rPr>
+                <w:rFonts w:ascii="Calibri" w:hAnsi="Calibri" w:cs="Calibri"/>
+                <w:szCs w:val="22"/>
+                <w:lang w:val="en"/>
+              </w:rPr>
+              <w:t xml:space="preserve"> /&gt;</w:t>
             </w:r>
           </w:p>
         </w:tc>
@@ -4812,7 +5126,25 @@
                 <w:szCs w:val="22"/>
                 <w:lang w:val="en"/>
               </w:rPr>
-              <w:t>&lt;DropGestureRecognizer /&gt;</w:t>
+              <w:t>&lt;</w:t>
+            </w:r>
+            <w:proofErr w:type="spellStart"/>
+            <w:r>
+              <w:rPr>
+                <w:rFonts w:ascii="Calibri" w:hAnsi="Calibri" w:cs="Calibri"/>
+                <w:szCs w:val="22"/>
+                <w:lang w:val="en"/>
+              </w:rPr>
+              <w:t>DropGestureRecognizer</w:t>
+            </w:r>
+            <w:proofErr w:type="spellEnd"/>
+            <w:r>
+              <w:rPr>
+                <w:rFonts w:ascii="Calibri" w:hAnsi="Calibri" w:cs="Calibri"/>
+                <w:szCs w:val="22"/>
+                <w:lang w:val="en"/>
+              </w:rPr>
+              <w:t xml:space="preserve"> /&gt;</w:t>
             </w:r>
           </w:p>
         </w:tc>
@@ -4902,7 +5234,25 @@
                 <w:szCs w:val="22"/>
                 <w:lang w:val="en"/>
               </w:rPr>
-              <w:t>&lt;PanGestureRecognizer /&gt;</w:t>
+              <w:t>&lt;</w:t>
+            </w:r>
+            <w:proofErr w:type="spellStart"/>
+            <w:r>
+              <w:rPr>
+                <w:rFonts w:ascii="Calibri" w:hAnsi="Calibri" w:cs="Calibri"/>
+                <w:szCs w:val="22"/>
+                <w:lang w:val="en"/>
+              </w:rPr>
+              <w:t>PanGestureRecognizer</w:t>
+            </w:r>
+            <w:proofErr w:type="spellEnd"/>
+            <w:r>
+              <w:rPr>
+                <w:rFonts w:ascii="Calibri" w:hAnsi="Calibri" w:cs="Calibri"/>
+                <w:szCs w:val="22"/>
+                <w:lang w:val="en"/>
+              </w:rPr>
+              <w:t xml:space="preserve"> /&gt;</w:t>
             </w:r>
           </w:p>
         </w:tc>
@@ -4992,7 +5342,25 @@
                 <w:szCs w:val="22"/>
                 <w:lang w:val="en"/>
               </w:rPr>
-              <w:t>&lt;PinchGestureRecognizer /&gt;</w:t>
+              <w:t>&lt;</w:t>
+            </w:r>
+            <w:proofErr w:type="spellStart"/>
+            <w:r>
+              <w:rPr>
+                <w:rFonts w:ascii="Calibri" w:hAnsi="Calibri" w:cs="Calibri"/>
+                <w:szCs w:val="22"/>
+                <w:lang w:val="en"/>
+              </w:rPr>
+              <w:t>PinchGestureRecognizer</w:t>
+            </w:r>
+            <w:proofErr w:type="spellEnd"/>
+            <w:r>
+              <w:rPr>
+                <w:rFonts w:ascii="Calibri" w:hAnsi="Calibri" w:cs="Calibri"/>
+                <w:szCs w:val="22"/>
+                <w:lang w:val="en"/>
+              </w:rPr>
+              <w:t xml:space="preserve"> /&gt;</w:t>
             </w:r>
           </w:p>
         </w:tc>
@@ -5083,7 +5451,25 @@
                 <w:szCs w:val="22"/>
                 <w:lang w:val="en"/>
               </w:rPr>
-              <w:t>&lt;PointerGestureRecognizer /&gt;</w:t>
+              <w:t>&lt;</w:t>
+            </w:r>
+            <w:proofErr w:type="spellStart"/>
+            <w:r>
+              <w:rPr>
+                <w:rFonts w:ascii="Calibri" w:hAnsi="Calibri" w:cs="Calibri"/>
+                <w:szCs w:val="22"/>
+                <w:lang w:val="en"/>
+              </w:rPr>
+              <w:t>PointerGestureRecognizer</w:t>
+            </w:r>
+            <w:proofErr w:type="spellEnd"/>
+            <w:r>
+              <w:rPr>
+                <w:rFonts w:ascii="Calibri" w:hAnsi="Calibri" w:cs="Calibri"/>
+                <w:szCs w:val="22"/>
+                <w:lang w:val="en"/>
+              </w:rPr>
+              <w:t xml:space="preserve"> /&gt;</w:t>
             </w:r>
           </w:p>
         </w:tc>
@@ -5173,7 +5559,25 @@
                 <w:szCs w:val="22"/>
                 <w:lang w:val="en"/>
               </w:rPr>
-              <w:t>&lt;SwipeGestureRecognizer /&gt;</w:t>
+              <w:t>&lt;</w:t>
+            </w:r>
+            <w:proofErr w:type="spellStart"/>
+            <w:r>
+              <w:rPr>
+                <w:rFonts w:ascii="Calibri" w:hAnsi="Calibri" w:cs="Calibri"/>
+                <w:szCs w:val="22"/>
+                <w:lang w:val="en"/>
+              </w:rPr>
+              <w:t>SwipeGestureRecognizer</w:t>
+            </w:r>
+            <w:proofErr w:type="spellEnd"/>
+            <w:r>
+              <w:rPr>
+                <w:rFonts w:ascii="Calibri" w:hAnsi="Calibri" w:cs="Calibri"/>
+                <w:szCs w:val="22"/>
+                <w:lang w:val="en"/>
+              </w:rPr>
+              <w:t xml:space="preserve"> /&gt;</w:t>
             </w:r>
           </w:p>
         </w:tc>
@@ -5230,6 +5634,7 @@
                 <w:lang w:val="en"/>
               </w:rPr>
             </w:pPr>
+            <w:proofErr w:type="spellStart"/>
             <w:r>
               <w:rPr>
                 <w:rFonts w:ascii="Calibri" w:hAnsi="Calibri" w:cs="Calibri"/>
@@ -5246,6 +5651,7 @@
               </w:rPr>
               <w:t>wv</w:t>
             </w:r>
+            <w:proofErr w:type="spellEnd"/>
           </w:p>
         </w:tc>
         <w:tc>
@@ -5271,95 +5677,257 @@
                 <w:szCs w:val="22"/>
                 <w:lang w:val="en"/>
               </w:rPr>
-              <w:t>&lt;BlazorWebView HostPage="wwwroot/index.html"&gt;</w:t>
-            </w:r>
-          </w:p>
-          <w:p>
-            <w:pPr>
-              <w:widowControl w:val="0"/>
-              <w:autoSpaceDE w:val="0"/>
-              <w:autoSpaceDN w:val="0"/>
-              <w:adjustRightInd w:val="0"/>
-              <w:spacing w:after="200"/>
-              <w:rPr>
-                <w:rFonts w:ascii="Calibri" w:hAnsi="Calibri" w:cs="Calibri"/>
-                <w:szCs w:val="22"/>
-                <w:lang w:val="en"/>
-              </w:rPr>
-            </w:pPr>
-            <w:r>
-              <w:rPr>
-                <w:rFonts w:ascii="Calibri" w:hAnsi="Calibri" w:cs="Calibri"/>
-                <w:szCs w:val="22"/>
-                <w:lang w:val="en"/>
-              </w:rPr>
-              <w:t xml:space="preserve">    &lt;BlazorWebView.RootComponents&gt;</w:t>
-            </w:r>
-          </w:p>
-          <w:p>
-            <w:pPr>
-              <w:widowControl w:val="0"/>
-              <w:autoSpaceDE w:val="0"/>
-              <w:autoSpaceDN w:val="0"/>
-              <w:adjustRightInd w:val="0"/>
-              <w:spacing w:after="200"/>
-              <w:rPr>
-                <w:rFonts w:ascii="Calibri" w:hAnsi="Calibri" w:cs="Calibri"/>
-                <w:szCs w:val="22"/>
-                <w:lang w:val="en"/>
-              </w:rPr>
-            </w:pPr>
-            <w:r>
-              <w:rPr>
-                <w:rFonts w:ascii="Calibri" w:hAnsi="Calibri" w:cs="Calibri"/>
-                <w:szCs w:val="22"/>
-                <w:lang w:val="en"/>
-              </w:rPr>
-              <w:t xml:space="preserve">        &lt;RootComponent ComponentType="{x:Type }" Selector="#app" /&gt;</w:t>
-            </w:r>
-          </w:p>
-          <w:p>
-            <w:pPr>
-              <w:widowControl w:val="0"/>
-              <w:autoSpaceDE w:val="0"/>
-              <w:autoSpaceDN w:val="0"/>
-              <w:adjustRightInd w:val="0"/>
-              <w:spacing w:after="200"/>
-              <w:rPr>
-                <w:rFonts w:ascii="Calibri" w:hAnsi="Calibri" w:cs="Calibri"/>
-                <w:szCs w:val="22"/>
-                <w:lang w:val="en"/>
-              </w:rPr>
-            </w:pPr>
-            <w:r>
-              <w:rPr>
-                <w:rFonts w:ascii="Calibri" w:hAnsi="Calibri" w:cs="Calibri"/>
-                <w:szCs w:val="22"/>
-                <w:lang w:val="en"/>
-              </w:rPr>
-              <w:t xml:space="preserve">    &lt;/BlazorWebView.RootComponents&gt;</w:t>
-            </w:r>
-          </w:p>
-          <w:p>
-            <w:pPr>
-              <w:widowControl w:val="0"/>
-              <w:autoSpaceDE w:val="0"/>
-              <w:autoSpaceDN w:val="0"/>
-              <w:adjustRightInd w:val="0"/>
-              <w:spacing w:after="200"/>
-              <w:rPr>
-                <w:rFonts w:ascii="Calibri" w:hAnsi="Calibri" w:cs="Calibri"/>
-                <w:szCs w:val="22"/>
-                <w:lang w:val="en"/>
-              </w:rPr>
-            </w:pPr>
-            <w:r>
-              <w:rPr>
-                <w:rFonts w:ascii="Calibri" w:hAnsi="Calibri" w:cs="Calibri"/>
-                <w:szCs w:val="22"/>
-                <w:lang w:val="en"/>
-              </w:rPr>
-              <w:t>&lt;/BlazorWebView&gt;</w:t>
+              <w:t>&lt;</w:t>
+            </w:r>
+            <w:proofErr w:type="spellStart"/>
+            <w:r>
+              <w:rPr>
+                <w:rFonts w:ascii="Calibri" w:hAnsi="Calibri" w:cs="Calibri"/>
+                <w:szCs w:val="22"/>
+                <w:lang w:val="en"/>
+              </w:rPr>
+              <w:t>BlazorWebView</w:t>
+            </w:r>
+            <w:proofErr w:type="spellEnd"/>
+            <w:r>
+              <w:rPr>
+                <w:rFonts w:ascii="Calibri" w:hAnsi="Calibri" w:cs="Calibri"/>
+                <w:szCs w:val="22"/>
+                <w:lang w:val="en"/>
+              </w:rPr>
+              <w:t xml:space="preserve"> </w:t>
+            </w:r>
+            <w:proofErr w:type="spellStart"/>
+            <w:r>
+              <w:rPr>
+                <w:rFonts w:ascii="Calibri" w:hAnsi="Calibri" w:cs="Calibri"/>
+                <w:szCs w:val="22"/>
+                <w:lang w:val="en"/>
+              </w:rPr>
+              <w:t>HostPage</w:t>
+            </w:r>
+            <w:proofErr w:type="spellEnd"/>
+            <w:r>
+              <w:rPr>
+                <w:rFonts w:ascii="Calibri" w:hAnsi="Calibri" w:cs="Calibri"/>
+                <w:szCs w:val="22"/>
+                <w:lang w:val="en"/>
+              </w:rPr>
+              <w:t>="</w:t>
+            </w:r>
+            <w:proofErr w:type="spellStart"/>
+            <w:r>
+              <w:rPr>
+                <w:rFonts w:ascii="Calibri" w:hAnsi="Calibri" w:cs="Calibri"/>
+                <w:szCs w:val="22"/>
+                <w:lang w:val="en"/>
+              </w:rPr>
+              <w:t>wwwroot</w:t>
+            </w:r>
+            <w:proofErr w:type="spellEnd"/>
+            <w:r>
+              <w:rPr>
+                <w:rFonts w:ascii="Calibri" w:hAnsi="Calibri" w:cs="Calibri"/>
+                <w:szCs w:val="22"/>
+                <w:lang w:val="en"/>
+              </w:rPr>
+              <w:t>/index.html"&gt;</w:t>
+            </w:r>
+          </w:p>
+          <w:p>
+            <w:pPr>
+              <w:widowControl w:val="0"/>
+              <w:autoSpaceDE w:val="0"/>
+              <w:autoSpaceDN w:val="0"/>
+              <w:adjustRightInd w:val="0"/>
+              <w:spacing w:after="200"/>
+              <w:rPr>
+                <w:rFonts w:ascii="Calibri" w:hAnsi="Calibri" w:cs="Calibri"/>
+                <w:szCs w:val="22"/>
+                <w:lang w:val="en"/>
+              </w:rPr>
+            </w:pPr>
+            <w:r>
+              <w:rPr>
+                <w:rFonts w:ascii="Calibri" w:hAnsi="Calibri" w:cs="Calibri"/>
+                <w:szCs w:val="22"/>
+                <w:lang w:val="en"/>
+              </w:rPr>
+              <w:t xml:space="preserve">    &lt;</w:t>
+            </w:r>
+            <w:proofErr w:type="spellStart"/>
+            <w:r>
+              <w:rPr>
+                <w:rFonts w:ascii="Calibri" w:hAnsi="Calibri" w:cs="Calibri"/>
+                <w:szCs w:val="22"/>
+                <w:lang w:val="en"/>
+              </w:rPr>
+              <w:t>BlazorWebView.RootComponents</w:t>
+            </w:r>
+            <w:proofErr w:type="spellEnd"/>
+            <w:r>
+              <w:rPr>
+                <w:rFonts w:ascii="Calibri" w:hAnsi="Calibri" w:cs="Calibri"/>
+                <w:szCs w:val="22"/>
+                <w:lang w:val="en"/>
+              </w:rPr>
+              <w:t>&gt;</w:t>
+            </w:r>
+          </w:p>
+          <w:p>
+            <w:pPr>
+              <w:widowControl w:val="0"/>
+              <w:autoSpaceDE w:val="0"/>
+              <w:autoSpaceDN w:val="0"/>
+              <w:adjustRightInd w:val="0"/>
+              <w:spacing w:after="200"/>
+              <w:rPr>
+                <w:rFonts w:ascii="Calibri" w:hAnsi="Calibri" w:cs="Calibri"/>
+                <w:szCs w:val="22"/>
+                <w:lang w:val="en"/>
+              </w:rPr>
+            </w:pPr>
+            <w:r>
+              <w:rPr>
+                <w:rFonts w:ascii="Calibri" w:hAnsi="Calibri" w:cs="Calibri"/>
+                <w:szCs w:val="22"/>
+                <w:lang w:val="en"/>
+              </w:rPr>
+              <w:t xml:space="preserve">        &lt;</w:t>
+            </w:r>
+            <w:proofErr w:type="spellStart"/>
+            <w:r>
+              <w:rPr>
+                <w:rFonts w:ascii="Calibri" w:hAnsi="Calibri" w:cs="Calibri"/>
+                <w:szCs w:val="22"/>
+                <w:lang w:val="en"/>
+              </w:rPr>
+              <w:t>RootComponent</w:t>
+            </w:r>
+            <w:proofErr w:type="spellEnd"/>
+            <w:r>
+              <w:rPr>
+                <w:rFonts w:ascii="Calibri" w:hAnsi="Calibri" w:cs="Calibri"/>
+                <w:szCs w:val="22"/>
+                <w:lang w:val="en"/>
+              </w:rPr>
+              <w:t xml:space="preserve"> </w:t>
+            </w:r>
+            <w:proofErr w:type="spellStart"/>
+            <w:r>
+              <w:rPr>
+                <w:rFonts w:ascii="Calibri" w:hAnsi="Calibri" w:cs="Calibri"/>
+                <w:szCs w:val="22"/>
+                <w:lang w:val="en"/>
+              </w:rPr>
+              <w:t>ComponentType</w:t>
+            </w:r>
+            <w:proofErr w:type="spellEnd"/>
+            <w:r>
+              <w:rPr>
+                <w:rFonts w:ascii="Calibri" w:hAnsi="Calibri" w:cs="Calibri"/>
+                <w:szCs w:val="22"/>
+                <w:lang w:val="en"/>
+              </w:rPr>
+              <w:t>="{</w:t>
+            </w:r>
+            <w:proofErr w:type="spellStart"/>
+            <w:r>
+              <w:rPr>
+                <w:rFonts w:ascii="Calibri" w:hAnsi="Calibri" w:cs="Calibri"/>
+                <w:szCs w:val="22"/>
+                <w:lang w:val="en"/>
+              </w:rPr>
+              <w:t>x:Type</w:t>
+            </w:r>
+            <w:proofErr w:type="spellEnd"/>
+            <w:r>
+              <w:rPr>
+                <w:rFonts w:ascii="Calibri" w:hAnsi="Calibri" w:cs="Calibri"/>
+                <w:szCs w:val="22"/>
+                <w:lang w:val="en"/>
+              </w:rPr>
+              <w:t xml:space="preserve"> }" Selector="#app" /&gt;</w:t>
+            </w:r>
+          </w:p>
+          <w:p>
+            <w:pPr>
+              <w:widowControl w:val="0"/>
+              <w:autoSpaceDE w:val="0"/>
+              <w:autoSpaceDN w:val="0"/>
+              <w:adjustRightInd w:val="0"/>
+              <w:spacing w:after="200"/>
+              <w:rPr>
+                <w:rFonts w:ascii="Calibri" w:hAnsi="Calibri" w:cs="Calibri"/>
+                <w:szCs w:val="22"/>
+                <w:lang w:val="en"/>
+              </w:rPr>
+            </w:pPr>
+            <w:r>
+              <w:rPr>
+                <w:rFonts w:ascii="Calibri" w:hAnsi="Calibri" w:cs="Calibri"/>
+                <w:szCs w:val="22"/>
+                <w:lang w:val="en"/>
+              </w:rPr>
+              <w:t xml:space="preserve">    &lt;/</w:t>
+            </w:r>
+            <w:proofErr w:type="spellStart"/>
+            <w:r>
+              <w:rPr>
+                <w:rFonts w:ascii="Calibri" w:hAnsi="Calibri" w:cs="Calibri"/>
+                <w:szCs w:val="22"/>
+                <w:lang w:val="en"/>
+              </w:rPr>
+              <w:t>BlazorWebView.RootComponents</w:t>
+            </w:r>
+            <w:proofErr w:type="spellEnd"/>
+            <w:r>
+              <w:rPr>
+                <w:rFonts w:ascii="Calibri" w:hAnsi="Calibri" w:cs="Calibri"/>
+                <w:szCs w:val="22"/>
+                <w:lang w:val="en"/>
+              </w:rPr>
+              <w:t>&gt;</w:t>
+            </w:r>
+          </w:p>
+          <w:p>
+            <w:pPr>
+              <w:widowControl w:val="0"/>
+              <w:autoSpaceDE w:val="0"/>
+              <w:autoSpaceDN w:val="0"/>
+              <w:adjustRightInd w:val="0"/>
+              <w:spacing w:after="200"/>
+              <w:rPr>
+                <w:rFonts w:ascii="Calibri" w:hAnsi="Calibri" w:cs="Calibri"/>
+                <w:szCs w:val="22"/>
+                <w:lang w:val="en"/>
+              </w:rPr>
+            </w:pPr>
+            <w:r>
+              <w:rPr>
+                <w:rFonts w:ascii="Calibri" w:hAnsi="Calibri" w:cs="Calibri"/>
+                <w:szCs w:val="22"/>
+                <w:lang w:val="en"/>
+              </w:rPr>
+              <w:t>&lt;/</w:t>
+            </w:r>
+            <w:proofErr w:type="spellStart"/>
+            <w:r>
+              <w:rPr>
+                <w:rFonts w:ascii="Calibri" w:hAnsi="Calibri" w:cs="Calibri"/>
+                <w:szCs w:val="22"/>
+                <w:lang w:val="en"/>
+              </w:rPr>
+              <w:t>BlazorWebView</w:t>
+            </w:r>
+            <w:proofErr w:type="spellEnd"/>
+            <w:r>
+              <w:rPr>
+                <w:rFonts w:ascii="Calibri" w:hAnsi="Calibri" w:cs="Calibri"/>
+                <w:szCs w:val="22"/>
+                <w:lang w:val="en"/>
+              </w:rPr>
+              <w:t>&gt;</w:t>
             </w:r>
           </w:p>
         </w:tc>
@@ -5471,7 +6039,25 @@
                 <w:szCs w:val="22"/>
                 <w:lang w:val="en"/>
               </w:rPr>
-              <w:t>;assembly=Microsoft.AspNetCore.Components.WebView.Maui"</w:t>
+              <w:t>;assembly=</w:t>
+            </w:r>
+            <w:proofErr w:type="spellStart"/>
+            <w:r>
+              <w:rPr>
+                <w:rFonts w:ascii="Calibri" w:hAnsi="Calibri" w:cs="Calibri"/>
+                <w:szCs w:val="22"/>
+                <w:lang w:val="en"/>
+              </w:rPr>
+              <w:t>Microsoft.AspNetCore.Components.WebView.Maui</w:t>
+            </w:r>
+            <w:proofErr w:type="spellEnd"/>
+            <w:r>
+              <w:rPr>
+                <w:rFonts w:ascii="Calibri" w:hAnsi="Calibri" w:cs="Calibri"/>
+                <w:szCs w:val="22"/>
+                <w:lang w:val="en"/>
+              </w:rPr>
+              <w:t>"</w:t>
             </w:r>
           </w:p>
         </w:tc>
@@ -5528,6 +6114,7 @@
                 <w:lang w:val="en"/>
               </w:rPr>
             </w:pPr>
+            <w:proofErr w:type="spellStart"/>
             <w:r>
               <w:rPr>
                 <w:rFonts w:ascii="Calibri" w:hAnsi="Calibri" w:cs="Calibri"/>
@@ -5536,6 +6123,7 @@
               </w:rPr>
               <w:t>wb</w:t>
             </w:r>
+            <w:proofErr w:type="spellEnd"/>
           </w:p>
         </w:tc>
         <w:tc>
@@ -5591,7 +6179,16 @@
                 <w:szCs w:val="22"/>
                 <w:lang w:val="en"/>
               </w:rPr>
-              <w:t>;assembly=Microsoft.AspNetCore.Components.WebView.</w:t>
+              <w:t>;assembly=</w:t>
+            </w:r>
+            <w:proofErr w:type="spellStart"/>
+            <w:r>
+              <w:rPr>
+                <w:rFonts w:ascii="Calibri" w:hAnsi="Calibri" w:cs="Calibri"/>
+                <w:szCs w:val="22"/>
+                <w:lang w:val="en"/>
+              </w:rPr>
+              <w:t>Microsoft.AspNetCore.Components.WebView.</w:t>
             </w:r>
             <w:r>
               <w:rPr>
@@ -5601,6 +6198,7 @@
               </w:rPr>
               <w:t>Wpf</w:t>
             </w:r>
+            <w:proofErr w:type="spellEnd"/>
             <w:r>
               <w:rPr>
                 <w:rFonts w:ascii="Calibri" w:hAnsi="Calibri" w:cs="Calibri"/>
@@ -5636,7 +6234,7 @@
           <w:lang w:val="en"/>
         </w:rPr>
       </w:pPr>
-      <w:bookmarkStart w:id="5" w:name="_Toc215221708"/>
+      <w:bookmarkStart w:id="5" w:name="_Toc225346382"/>
       <w:r>
         <w:rPr>
           <w:lang w:val="en"/>
@@ -5746,6 +6344,7 @@
         </w:rPr>
         <w:t xml:space="preserve"> as a </w:t>
       </w:r>
+      <w:proofErr w:type="spellStart"/>
       <w:r>
         <w:rPr>
           <w:rFonts w:ascii="Calibri" w:hAnsi="Calibri" w:cs="Calibri"/>
@@ -5756,6 +6355,7 @@
         </w:rPr>
         <w:t>SurroundWith</w:t>
       </w:r>
+      <w:proofErr w:type="spellEnd"/>
       <w:r>
         <w:rPr>
           <w:rFonts w:ascii="Calibri" w:hAnsi="Calibri" w:cs="Calibri"/>
@@ -5780,6 +6380,7 @@
         </w:rPr>
         <w:t xml:space="preserve">the </w:t>
       </w:r>
+      <w:proofErr w:type="spellStart"/>
       <w:r>
         <w:rPr>
           <w:rFonts w:ascii="Calibri" w:hAnsi="Calibri" w:cs="Calibri"/>
@@ -5790,6 +6391,7 @@
         </w:rPr>
         <w:t>CSharp</w:t>
       </w:r>
+      <w:proofErr w:type="spellEnd"/>
       <w:r>
         <w:rPr>
           <w:rFonts w:ascii="Calibri" w:hAnsi="Calibri" w:cs="Calibri"/>
@@ -6301,6 +6903,7 @@
                 <w:lang w:val="en"/>
               </w:rPr>
             </w:pPr>
+            <w:proofErr w:type="spellStart"/>
             <w:r>
               <w:rPr>
                 <w:rFonts w:ascii="Calibri" w:hAnsi="Calibri" w:cs="Calibri"/>
@@ -6311,6 +6914,7 @@
               </w:rPr>
               <w:t>aeh</w:t>
             </w:r>
+            <w:proofErr w:type="spellEnd"/>
           </w:p>
         </w:tc>
         <w:tc>
@@ -6338,6 +6942,7 @@
               </w:rPr>
               <w:t xml:space="preserve">private async void </w:t>
             </w:r>
+            <w:proofErr w:type="spellStart"/>
             <w:r>
               <w:rPr>
                 <w:rFonts w:ascii="Calibri" w:hAnsi="Calibri" w:cs="Calibri"/>
@@ -6347,13 +6952,32 @@
               </w:rPr>
               <w:t>MyMethod</w:t>
             </w:r>
-            <w:r>
-              <w:rPr>
-                <w:rFonts w:ascii="Calibri" w:hAnsi="Calibri" w:cs="Calibri"/>
-                <w:szCs w:val="22"/>
-                <w:lang w:val="en"/>
-              </w:rPr>
-              <w:t>(object sender, EventArgs e)</w:t>
+            <w:proofErr w:type="spellEnd"/>
+            <w:r>
+              <w:rPr>
+                <w:rFonts w:ascii="Calibri" w:hAnsi="Calibri" w:cs="Calibri"/>
+                <w:szCs w:val="22"/>
+                <w:lang w:val="en"/>
+              </w:rPr>
+              <w:t xml:space="preserve">(object sender, </w:t>
+            </w:r>
+            <w:proofErr w:type="spellStart"/>
+            <w:r>
+              <w:rPr>
+                <w:rFonts w:ascii="Calibri" w:hAnsi="Calibri" w:cs="Calibri"/>
+                <w:szCs w:val="22"/>
+                <w:lang w:val="en"/>
+              </w:rPr>
+              <w:t>EventArgs</w:t>
+            </w:r>
+            <w:proofErr w:type="spellEnd"/>
+            <w:r>
+              <w:rPr>
+                <w:rFonts w:ascii="Calibri" w:hAnsi="Calibri" w:cs="Calibri"/>
+                <w:szCs w:val="22"/>
+                <w:lang w:val="en"/>
+              </w:rPr>
+              <w:t xml:space="preserve"> e)</w:t>
             </w:r>
           </w:p>
           <w:p>
@@ -6452,6 +7076,7 @@
                 <w:lang w:val="en"/>
               </w:rPr>
             </w:pPr>
+            <w:proofErr w:type="spellStart"/>
             <w:r>
               <w:rPr>
                 <w:rFonts w:ascii="Calibri" w:hAnsi="Calibri" w:cs="Calibri"/>
@@ -6460,6 +7085,7 @@
               </w:rPr>
               <w:t>propap</w:t>
             </w:r>
+            <w:proofErr w:type="spellEnd"/>
           </w:p>
         </w:tc>
         <w:tc>
@@ -6501,6 +7127,7 @@
               </w:rPr>
               <w:t xml:space="preserve">ssuming </w:t>
             </w:r>
+            <w:proofErr w:type="spellStart"/>
             <w:r>
               <w:rPr>
                 <w:rFonts w:ascii="Calibri" w:hAnsi="Calibri" w:cs="Calibri"/>
@@ -6512,6 +7139,7 @@
               </w:rPr>
               <w:t>MyClass</w:t>
             </w:r>
+            <w:proofErr w:type="spellEnd"/>
             <w:r>
               <w:rPr>
                 <w:rFonts w:ascii="Calibri" w:hAnsi="Calibri" w:cs="Calibri"/>
@@ -6542,8 +7170,45 @@
                 <w:szCs w:val="22"/>
                 <w:lang w:val="en"/>
               </w:rPr>
-              <w:t xml:space="preserve">public static readonly BindableProperty </w:t>
-            </w:r>
+              <w:t xml:space="preserve">public static </w:t>
+            </w:r>
+            <w:proofErr w:type="spellStart"/>
+            <w:r>
+              <w:rPr>
+                <w:rFonts w:ascii="Calibri" w:hAnsi="Calibri" w:cs="Calibri"/>
+                <w:szCs w:val="22"/>
+                <w:lang w:val="en"/>
+              </w:rPr>
+              <w:t>readonly</w:t>
+            </w:r>
+            <w:proofErr w:type="spellEnd"/>
+            <w:r>
+              <w:rPr>
+                <w:rFonts w:ascii="Calibri" w:hAnsi="Calibri" w:cs="Calibri"/>
+                <w:szCs w:val="22"/>
+                <w:lang w:val="en"/>
+              </w:rPr>
+              <w:t xml:space="preserve"> </w:t>
+            </w:r>
+            <w:proofErr w:type="spellStart"/>
+            <w:r>
+              <w:rPr>
+                <w:rFonts w:ascii="Calibri" w:hAnsi="Calibri" w:cs="Calibri"/>
+                <w:szCs w:val="22"/>
+                <w:lang w:val="en"/>
+              </w:rPr>
+              <w:t>BindableProperty</w:t>
+            </w:r>
+            <w:proofErr w:type="spellEnd"/>
+            <w:r>
+              <w:rPr>
+                <w:rFonts w:ascii="Calibri" w:hAnsi="Calibri" w:cs="Calibri"/>
+                <w:szCs w:val="22"/>
+                <w:lang w:val="en"/>
+              </w:rPr>
+              <w:t xml:space="preserve"> </w:t>
+            </w:r>
+            <w:proofErr w:type="spellStart"/>
             <w:r>
               <w:rPr>
                 <w:rFonts w:ascii="Calibri" w:hAnsi="Calibri" w:cs="Calibri"/>
@@ -6559,7 +7224,25 @@
                 <w:szCs w:val="22"/>
                 <w:lang w:val="en"/>
               </w:rPr>
-              <w:t>Property = BindableProperty.</w:t>
+              <w:t>Property</w:t>
+            </w:r>
+            <w:proofErr w:type="spellEnd"/>
+            <w:r>
+              <w:rPr>
+                <w:rFonts w:ascii="Calibri" w:hAnsi="Calibri" w:cs="Calibri"/>
+                <w:szCs w:val="22"/>
+                <w:lang w:val="en"/>
+              </w:rPr>
+              <w:t xml:space="preserve"> = </w:t>
+            </w:r>
+            <w:proofErr w:type="spellStart"/>
+            <w:r>
+              <w:rPr>
+                <w:rFonts w:ascii="Calibri" w:hAnsi="Calibri" w:cs="Calibri"/>
+                <w:szCs w:val="22"/>
+                <w:lang w:val="en"/>
+              </w:rPr>
+              <w:t>BindableProperty.</w:t>
             </w:r>
             <w:r>
               <w:rPr>
@@ -6569,14 +7252,34 @@
               </w:rPr>
               <w:t>CreateAttached</w:t>
             </w:r>
-            <w:r>
-              <w:rPr>
-                <w:rFonts w:ascii="Calibri" w:hAnsi="Calibri" w:cs="Calibri"/>
-                <w:szCs w:val="22"/>
-                <w:lang w:val="en"/>
-              </w:rPr>
-              <w:t>(nameof(</w:t>
-            </w:r>
+            <w:proofErr w:type="spellEnd"/>
+            <w:r>
+              <w:rPr>
+                <w:rFonts w:ascii="Calibri" w:hAnsi="Calibri" w:cs="Calibri"/>
+                <w:szCs w:val="22"/>
+                <w:lang w:val="en"/>
+              </w:rPr>
+              <w:t>(</w:t>
+            </w:r>
+            <w:proofErr w:type="spellStart"/>
+            <w:r>
+              <w:rPr>
+                <w:rFonts w:ascii="Calibri" w:hAnsi="Calibri" w:cs="Calibri"/>
+                <w:szCs w:val="22"/>
+                <w:lang w:val="en"/>
+              </w:rPr>
+              <w:t>nameof</w:t>
+            </w:r>
+            <w:proofErr w:type="spellEnd"/>
+            <w:r>
+              <w:rPr>
+                <w:rFonts w:ascii="Calibri" w:hAnsi="Calibri" w:cs="Calibri"/>
+                <w:szCs w:val="22"/>
+                <w:lang w:val="en"/>
+              </w:rPr>
+              <w:t>(</w:t>
+            </w:r>
+            <w:proofErr w:type="spellStart"/>
             <w:r>
               <w:rPr>
                 <w:rFonts w:ascii="Calibri" w:hAnsi="Calibri" w:cs="Calibri"/>
@@ -6595,13 +7298,32 @@
               </w:rPr>
               <w:t>Property</w:t>
             </w:r>
-            <w:r>
-              <w:rPr>
-                <w:rFonts w:ascii="Calibri" w:hAnsi="Calibri" w:cs="Calibri"/>
-                <w:szCs w:val="22"/>
-                <w:lang w:val="en"/>
-              </w:rPr>
-              <w:t>), typeof(</w:t>
+            <w:proofErr w:type="spellEnd"/>
+            <w:r>
+              <w:rPr>
+                <w:rFonts w:ascii="Calibri" w:hAnsi="Calibri" w:cs="Calibri"/>
+                <w:szCs w:val="22"/>
+                <w:lang w:val="en"/>
+              </w:rPr>
+              <w:t xml:space="preserve">), </w:t>
+            </w:r>
+            <w:proofErr w:type="spellStart"/>
+            <w:r>
+              <w:rPr>
+                <w:rFonts w:ascii="Calibri" w:hAnsi="Calibri" w:cs="Calibri"/>
+                <w:szCs w:val="22"/>
+                <w:lang w:val="en"/>
+              </w:rPr>
+              <w:t>typeof</w:t>
+            </w:r>
+            <w:proofErr w:type="spellEnd"/>
+            <w:r>
+              <w:rPr>
+                <w:rFonts w:ascii="Calibri" w:hAnsi="Calibri" w:cs="Calibri"/>
+                <w:szCs w:val="22"/>
+                <w:lang w:val="en"/>
+              </w:rPr>
+              <w:t>(</w:t>
             </w:r>
             <w:r>
               <w:rPr>
@@ -6618,8 +7340,27 @@
                 <w:szCs w:val="22"/>
                 <w:lang w:val="en"/>
               </w:rPr>
-              <w:t>), typeof(</w:t>
-            </w:r>
+              <w:t xml:space="preserve">), </w:t>
+            </w:r>
+            <w:proofErr w:type="spellStart"/>
+            <w:r>
+              <w:rPr>
+                <w:rFonts w:ascii="Calibri" w:hAnsi="Calibri" w:cs="Calibri"/>
+                <w:szCs w:val="22"/>
+                <w:lang w:val="en"/>
+              </w:rPr>
+              <w:t>typeof</w:t>
+            </w:r>
+            <w:proofErr w:type="spellEnd"/>
+            <w:r>
+              <w:rPr>
+                <w:rFonts w:ascii="Calibri" w:hAnsi="Calibri" w:cs="Calibri"/>
+                <w:szCs w:val="22"/>
+                <w:lang w:val="en"/>
+              </w:rPr>
+              <w:t>(</w:t>
+            </w:r>
+            <w:proofErr w:type="spellStart"/>
             <w:r>
               <w:rPr>
                 <w:rFonts w:ascii="Calibri" w:hAnsi="Calibri" w:cs="Calibri"/>
@@ -6629,6 +7370,7 @@
               </w:rPr>
               <w:t>MyClass</w:t>
             </w:r>
+            <w:proofErr w:type="spellEnd"/>
             <w:r>
               <w:rPr>
                 <w:rFonts w:ascii="Calibri" w:hAnsi="Calibri" w:cs="Calibri"/>
@@ -6690,7 +7432,16 @@
                 <w:szCs w:val="22"/>
                 <w:lang w:val="en"/>
               </w:rPr>
-              <w:t xml:space="preserve"> Get</w:t>
+              <w:t xml:space="preserve"> </w:t>
+            </w:r>
+            <w:proofErr w:type="spellStart"/>
+            <w:r>
+              <w:rPr>
+                <w:rFonts w:ascii="Calibri" w:hAnsi="Calibri" w:cs="Calibri"/>
+                <w:szCs w:val="22"/>
+                <w:lang w:val="en"/>
+              </w:rPr>
+              <w:t>Get</w:t>
             </w:r>
             <w:r>
               <w:rPr>
@@ -6701,13 +7452,32 @@
               </w:rPr>
               <w:t>Name</w:t>
             </w:r>
-            <w:r>
-              <w:rPr>
-                <w:rFonts w:ascii="Calibri" w:hAnsi="Calibri" w:cs="Calibri"/>
-                <w:szCs w:val="22"/>
-                <w:lang w:val="en"/>
-              </w:rPr>
-              <w:t>(BindableObject bindable) =&gt; (</w:t>
+            <w:proofErr w:type="spellEnd"/>
+            <w:r>
+              <w:rPr>
+                <w:rFonts w:ascii="Calibri" w:hAnsi="Calibri" w:cs="Calibri"/>
+                <w:szCs w:val="22"/>
+                <w:lang w:val="en"/>
+              </w:rPr>
+              <w:t>(</w:t>
+            </w:r>
+            <w:proofErr w:type="spellStart"/>
+            <w:r>
+              <w:rPr>
+                <w:rFonts w:ascii="Calibri" w:hAnsi="Calibri" w:cs="Calibri"/>
+                <w:szCs w:val="22"/>
+                <w:lang w:val="en"/>
+              </w:rPr>
+              <w:t>BindableObject</w:t>
+            </w:r>
+            <w:proofErr w:type="spellEnd"/>
+            <w:r>
+              <w:rPr>
+                <w:rFonts w:ascii="Calibri" w:hAnsi="Calibri" w:cs="Calibri"/>
+                <w:szCs w:val="22"/>
+                <w:lang w:val="en"/>
+              </w:rPr>
+              <w:t xml:space="preserve"> bindable) =&gt; (</w:t>
             </w:r>
             <w:r>
               <w:rPr>
@@ -6724,8 +7494,27 @@
                 <w:szCs w:val="22"/>
                 <w:lang w:val="en"/>
               </w:rPr>
-              <w:t>)bindable.GetValue(</w:t>
-            </w:r>
+              <w:t>)</w:t>
+            </w:r>
+            <w:proofErr w:type="spellStart"/>
+            <w:r>
+              <w:rPr>
+                <w:rFonts w:ascii="Calibri" w:hAnsi="Calibri" w:cs="Calibri"/>
+                <w:szCs w:val="22"/>
+                <w:lang w:val="en"/>
+              </w:rPr>
+              <w:t>bindable.GetValue</w:t>
+            </w:r>
+            <w:proofErr w:type="spellEnd"/>
+            <w:r>
+              <w:rPr>
+                <w:rFonts w:ascii="Calibri" w:hAnsi="Calibri" w:cs="Calibri"/>
+                <w:szCs w:val="22"/>
+                <w:lang w:val="en"/>
+              </w:rPr>
+              <w:t>(</w:t>
+            </w:r>
+            <w:proofErr w:type="spellStart"/>
             <w:r>
               <w:rPr>
                 <w:rFonts w:ascii="Calibri" w:hAnsi="Calibri" w:cs="Calibri"/>
@@ -6744,6 +7533,7 @@
               </w:rPr>
               <w:t>Property</w:t>
             </w:r>
+            <w:proofErr w:type="spellEnd"/>
             <w:r>
               <w:rPr>
                 <w:rFonts w:ascii="Calibri" w:hAnsi="Calibri" w:cs="Calibri"/>
@@ -6772,7 +7562,16 @@
                 <w:szCs w:val="22"/>
                 <w:lang w:val="en"/>
               </w:rPr>
-              <w:t>public static void Set</w:t>
+              <w:t xml:space="preserve">public static void </w:t>
+            </w:r>
+            <w:proofErr w:type="spellStart"/>
+            <w:r>
+              <w:rPr>
+                <w:rFonts w:ascii="Calibri" w:hAnsi="Calibri" w:cs="Calibri"/>
+                <w:szCs w:val="22"/>
+                <w:lang w:val="en"/>
+              </w:rPr>
+              <w:t>Set</w:t>
             </w:r>
             <w:r>
               <w:rPr>
@@ -6783,13 +7582,32 @@
               </w:rPr>
               <w:t>Name</w:t>
             </w:r>
-            <w:r>
-              <w:rPr>
-                <w:rFonts w:ascii="Calibri" w:hAnsi="Calibri" w:cs="Calibri"/>
-                <w:szCs w:val="22"/>
-                <w:lang w:val="en"/>
-              </w:rPr>
-              <w:t xml:space="preserve">(BindableObject bindable, </w:t>
+            <w:proofErr w:type="spellEnd"/>
+            <w:r>
+              <w:rPr>
+                <w:rFonts w:ascii="Calibri" w:hAnsi="Calibri" w:cs="Calibri"/>
+                <w:szCs w:val="22"/>
+                <w:lang w:val="en"/>
+              </w:rPr>
+              <w:t>(</w:t>
+            </w:r>
+            <w:proofErr w:type="spellStart"/>
+            <w:r>
+              <w:rPr>
+                <w:rFonts w:ascii="Calibri" w:hAnsi="Calibri" w:cs="Calibri"/>
+                <w:szCs w:val="22"/>
+                <w:lang w:val="en"/>
+              </w:rPr>
+              <w:t>BindableObject</w:t>
+            </w:r>
+            <w:proofErr w:type="spellEnd"/>
+            <w:r>
+              <w:rPr>
+                <w:rFonts w:ascii="Calibri" w:hAnsi="Calibri" w:cs="Calibri"/>
+                <w:szCs w:val="22"/>
+                <w:lang w:val="en"/>
+              </w:rPr>
+              <w:t xml:space="preserve"> bindable, </w:t>
             </w:r>
             <w:r>
               <w:rPr>
@@ -6806,8 +7624,27 @@
                 <w:szCs w:val="22"/>
                 <w:lang w:val="en"/>
               </w:rPr>
-              <w:t xml:space="preserve"> value) =&gt; bindable.SetValue(</w:t>
-            </w:r>
+              <w:t xml:space="preserve"> value) =&gt; </w:t>
+            </w:r>
+            <w:proofErr w:type="spellStart"/>
+            <w:r>
+              <w:rPr>
+                <w:rFonts w:ascii="Calibri" w:hAnsi="Calibri" w:cs="Calibri"/>
+                <w:szCs w:val="22"/>
+                <w:lang w:val="en"/>
+              </w:rPr>
+              <w:t>bindable.SetValue</w:t>
+            </w:r>
+            <w:proofErr w:type="spellEnd"/>
+            <w:r>
+              <w:rPr>
+                <w:rFonts w:ascii="Calibri" w:hAnsi="Calibri" w:cs="Calibri"/>
+                <w:szCs w:val="22"/>
+                <w:lang w:val="en"/>
+              </w:rPr>
+              <w:t>(</w:t>
+            </w:r>
+            <w:proofErr w:type="spellStart"/>
             <w:r>
               <w:rPr>
                 <w:rFonts w:ascii="Calibri" w:hAnsi="Calibri" w:cs="Calibri"/>
@@ -6826,6 +7663,7 @@
               </w:rPr>
               <w:t>Property</w:t>
             </w:r>
+            <w:proofErr w:type="spellEnd"/>
             <w:r>
               <w:rPr>
                 <w:rFonts w:ascii="Calibri" w:hAnsi="Calibri" w:cs="Calibri"/>
@@ -6887,6 +7725,7 @@
                 <w:lang w:val="en"/>
               </w:rPr>
             </w:pPr>
+            <w:proofErr w:type="spellStart"/>
             <w:r>
               <w:rPr>
                 <w:rFonts w:ascii="Calibri" w:hAnsi="Calibri" w:cs="Calibri"/>
@@ -6895,6 +7734,7 @@
               </w:rPr>
               <w:t>propbp</w:t>
             </w:r>
+            <w:proofErr w:type="spellEnd"/>
           </w:p>
         </w:tc>
         <w:tc>
@@ -6936,6 +7776,7 @@
               </w:rPr>
               <w:t xml:space="preserve">ssuming </w:t>
             </w:r>
+            <w:proofErr w:type="spellStart"/>
             <w:r>
               <w:rPr>
                 <w:rFonts w:ascii="Calibri" w:hAnsi="Calibri" w:cs="Calibri"/>
@@ -6947,6 +7788,7 @@
               </w:rPr>
               <w:t>MyClass</w:t>
             </w:r>
+            <w:proofErr w:type="spellEnd"/>
             <w:r>
               <w:rPr>
                 <w:rFonts w:ascii="Calibri" w:hAnsi="Calibri" w:cs="Calibri"/>
@@ -6977,8 +7819,45 @@
                 <w:szCs w:val="22"/>
                 <w:lang w:val="en"/>
               </w:rPr>
-              <w:t xml:space="preserve">public static readonly BindableProperty </w:t>
-            </w:r>
+              <w:t xml:space="preserve">public static </w:t>
+            </w:r>
+            <w:proofErr w:type="spellStart"/>
+            <w:r>
+              <w:rPr>
+                <w:rFonts w:ascii="Calibri" w:hAnsi="Calibri" w:cs="Calibri"/>
+                <w:szCs w:val="22"/>
+                <w:lang w:val="en"/>
+              </w:rPr>
+              <w:t>readonly</w:t>
+            </w:r>
+            <w:proofErr w:type="spellEnd"/>
+            <w:r>
+              <w:rPr>
+                <w:rFonts w:ascii="Calibri" w:hAnsi="Calibri" w:cs="Calibri"/>
+                <w:szCs w:val="22"/>
+                <w:lang w:val="en"/>
+              </w:rPr>
+              <w:t xml:space="preserve"> </w:t>
+            </w:r>
+            <w:proofErr w:type="spellStart"/>
+            <w:r>
+              <w:rPr>
+                <w:rFonts w:ascii="Calibri" w:hAnsi="Calibri" w:cs="Calibri"/>
+                <w:szCs w:val="22"/>
+                <w:lang w:val="en"/>
+              </w:rPr>
+              <w:t>BindableProperty</w:t>
+            </w:r>
+            <w:proofErr w:type="spellEnd"/>
+            <w:r>
+              <w:rPr>
+                <w:rFonts w:ascii="Calibri" w:hAnsi="Calibri" w:cs="Calibri"/>
+                <w:szCs w:val="22"/>
+                <w:lang w:val="en"/>
+              </w:rPr>
+              <w:t xml:space="preserve"> </w:t>
+            </w:r>
+            <w:proofErr w:type="spellStart"/>
             <w:r>
               <w:rPr>
                 <w:rFonts w:ascii="Calibri" w:hAnsi="Calibri" w:cs="Calibri"/>
@@ -6994,7 +7873,52 @@
                 <w:szCs w:val="22"/>
                 <w:lang w:val="en"/>
               </w:rPr>
-              <w:t>Property = BindableProperty.Create(nameof(</w:t>
+              <w:t>Property</w:t>
+            </w:r>
+            <w:proofErr w:type="spellEnd"/>
+            <w:r>
+              <w:rPr>
+                <w:rFonts w:ascii="Calibri" w:hAnsi="Calibri" w:cs="Calibri"/>
+                <w:szCs w:val="22"/>
+                <w:lang w:val="en"/>
+              </w:rPr>
+              <w:t xml:space="preserve"> = </w:t>
+            </w:r>
+            <w:proofErr w:type="spellStart"/>
+            <w:r>
+              <w:rPr>
+                <w:rFonts w:ascii="Calibri" w:hAnsi="Calibri" w:cs="Calibri"/>
+                <w:szCs w:val="22"/>
+                <w:lang w:val="en"/>
+              </w:rPr>
+              <w:t>BindableProperty.Create</w:t>
+            </w:r>
+            <w:proofErr w:type="spellEnd"/>
+            <w:r>
+              <w:rPr>
+                <w:rFonts w:ascii="Calibri" w:hAnsi="Calibri" w:cs="Calibri"/>
+                <w:szCs w:val="22"/>
+                <w:lang w:val="en"/>
+              </w:rPr>
+              <w:t>(</w:t>
+            </w:r>
+            <w:proofErr w:type="spellStart"/>
+            <w:r>
+              <w:rPr>
+                <w:rFonts w:ascii="Calibri" w:hAnsi="Calibri" w:cs="Calibri"/>
+                <w:szCs w:val="22"/>
+                <w:lang w:val="en"/>
+              </w:rPr>
+              <w:t>nameof</w:t>
+            </w:r>
+            <w:proofErr w:type="spellEnd"/>
+            <w:r>
+              <w:rPr>
+                <w:rFonts w:ascii="Calibri" w:hAnsi="Calibri" w:cs="Calibri"/>
+                <w:szCs w:val="22"/>
+                <w:lang w:val="en"/>
+              </w:rPr>
+              <w:t>(</w:t>
             </w:r>
             <w:r>
               <w:rPr>
@@ -7011,7 +7935,25 @@
                 <w:szCs w:val="22"/>
                 <w:lang w:val="en"/>
               </w:rPr>
-              <w:t>), typeof(</w:t>
+              <w:t xml:space="preserve">), </w:t>
+            </w:r>
+            <w:proofErr w:type="spellStart"/>
+            <w:r>
+              <w:rPr>
+                <w:rFonts w:ascii="Calibri" w:hAnsi="Calibri" w:cs="Calibri"/>
+                <w:szCs w:val="22"/>
+                <w:lang w:val="en"/>
+              </w:rPr>
+              <w:t>typeof</w:t>
+            </w:r>
+            <w:proofErr w:type="spellEnd"/>
+            <w:r>
+              <w:rPr>
+                <w:rFonts w:ascii="Calibri" w:hAnsi="Calibri" w:cs="Calibri"/>
+                <w:szCs w:val="22"/>
+                <w:lang w:val="en"/>
+              </w:rPr>
+              <w:t>(</w:t>
             </w:r>
             <w:r>
               <w:rPr>
@@ -7028,8 +7970,27 @@
                 <w:szCs w:val="22"/>
                 <w:lang w:val="en"/>
               </w:rPr>
-              <w:t>), typeof(</w:t>
-            </w:r>
+              <w:t xml:space="preserve">), </w:t>
+            </w:r>
+            <w:proofErr w:type="spellStart"/>
+            <w:r>
+              <w:rPr>
+                <w:rFonts w:ascii="Calibri" w:hAnsi="Calibri" w:cs="Calibri"/>
+                <w:szCs w:val="22"/>
+                <w:lang w:val="en"/>
+              </w:rPr>
+              <w:t>typeof</w:t>
+            </w:r>
+            <w:proofErr w:type="spellEnd"/>
+            <w:r>
+              <w:rPr>
+                <w:rFonts w:ascii="Calibri" w:hAnsi="Calibri" w:cs="Calibri"/>
+                <w:szCs w:val="22"/>
+                <w:lang w:val="en"/>
+              </w:rPr>
+              <w:t>(</w:t>
+            </w:r>
+            <w:proofErr w:type="spellStart"/>
             <w:r>
               <w:rPr>
                 <w:rFonts w:ascii="Calibri" w:hAnsi="Calibri" w:cs="Calibri"/>
@@ -7039,6 +8000,7 @@
               </w:rPr>
               <w:t>MyClass</w:t>
             </w:r>
+            <w:proofErr w:type="spellEnd"/>
             <w:r>
               <w:rPr>
                 <w:rFonts w:ascii="Calibri" w:hAnsi="Calibri" w:cs="Calibri"/>
@@ -7169,8 +8131,27 @@
                 <w:szCs w:val="22"/>
                 <w:lang w:val="en"/>
               </w:rPr>
-              <w:t>)GetValue(</w:t>
-            </w:r>
+              <w:t>)</w:t>
+            </w:r>
+            <w:proofErr w:type="spellStart"/>
+            <w:r>
+              <w:rPr>
+                <w:rFonts w:ascii="Calibri" w:hAnsi="Calibri" w:cs="Calibri"/>
+                <w:szCs w:val="22"/>
+                <w:lang w:val="en"/>
+              </w:rPr>
+              <w:t>GetValue</w:t>
+            </w:r>
+            <w:proofErr w:type="spellEnd"/>
+            <w:r>
+              <w:rPr>
+                <w:rFonts w:ascii="Calibri" w:hAnsi="Calibri" w:cs="Calibri"/>
+                <w:szCs w:val="22"/>
+                <w:lang w:val="en"/>
+              </w:rPr>
+              <w:t>(</w:t>
+            </w:r>
+            <w:proofErr w:type="spellStart"/>
             <w:r>
               <w:rPr>
                 <w:rFonts w:ascii="Calibri" w:hAnsi="Calibri" w:cs="Calibri"/>
@@ -7180,6 +8161,7 @@
               </w:rPr>
               <w:t>NameProperty</w:t>
             </w:r>
+            <w:proofErr w:type="spellEnd"/>
             <w:r>
               <w:rPr>
                 <w:rFonts w:ascii="Calibri" w:hAnsi="Calibri" w:cs="Calibri"/>
@@ -7208,8 +8190,27 @@
                 <w:szCs w:val="22"/>
                 <w:lang w:val="en"/>
               </w:rPr>
-              <w:t>set =&gt; SetValue(</w:t>
-            </w:r>
+              <w:t xml:space="preserve">set =&gt; </w:t>
+            </w:r>
+            <w:proofErr w:type="spellStart"/>
+            <w:r>
+              <w:rPr>
+                <w:rFonts w:ascii="Calibri" w:hAnsi="Calibri" w:cs="Calibri"/>
+                <w:szCs w:val="22"/>
+                <w:lang w:val="en"/>
+              </w:rPr>
+              <w:t>SetValue</w:t>
+            </w:r>
+            <w:proofErr w:type="spellEnd"/>
+            <w:r>
+              <w:rPr>
+                <w:rFonts w:ascii="Calibri" w:hAnsi="Calibri" w:cs="Calibri"/>
+                <w:szCs w:val="22"/>
+                <w:lang w:val="en"/>
+              </w:rPr>
+              <w:t>(</w:t>
+            </w:r>
+            <w:proofErr w:type="spellStart"/>
             <w:r>
               <w:rPr>
                 <w:rFonts w:ascii="Calibri" w:hAnsi="Calibri" w:cs="Calibri"/>
@@ -7219,6 +8220,7 @@
               </w:rPr>
               <w:t>NameProperty</w:t>
             </w:r>
+            <w:proofErr w:type="spellEnd"/>
             <w:r>
               <w:rPr>
                 <w:rFonts w:ascii="Calibri" w:hAnsi="Calibri" w:cs="Calibri"/>
@@ -7303,6 +8305,7 @@
                 <w:lang w:val="en"/>
               </w:rPr>
             </w:pPr>
+            <w:proofErr w:type="spellStart"/>
             <w:r>
               <w:rPr>
                 <w:rFonts w:ascii="Calibri" w:hAnsi="Calibri" w:cs="Calibri"/>
@@ -7312,6 +8315,7 @@
               </w:rPr>
               <w:t>propc</w:t>
             </w:r>
+            <w:proofErr w:type="spellEnd"/>
           </w:p>
           <w:p>
             <w:pPr>
@@ -7335,6 +8339,7 @@
               </w:rPr>
               <w:t xml:space="preserve">(This has been shortened to </w:t>
             </w:r>
+            <w:proofErr w:type="spellStart"/>
             <w:r>
               <w:rPr>
                 <w:rFonts w:ascii="Calibri" w:hAnsi="Calibri" w:cs="Calibri"/>
@@ -7345,6 +8350,7 @@
               </w:rPr>
               <w:t>propc</w:t>
             </w:r>
+            <w:proofErr w:type="spellEnd"/>
             <w:r>
               <w:rPr>
                 <w:rFonts w:ascii="Calibri" w:hAnsi="Calibri" w:cs="Calibri"/>
@@ -7353,6 +8359,7 @@
               </w:rPr>
               <w:t xml:space="preserve"> from </w:t>
             </w:r>
+            <w:proofErr w:type="spellStart"/>
             <w:r>
               <w:rPr>
                 <w:rFonts w:ascii="Calibri" w:hAnsi="Calibri" w:cs="Calibri"/>
@@ -7363,6 +8370,7 @@
               </w:rPr>
               <w:t>propcomet</w:t>
             </w:r>
+            <w:proofErr w:type="spellEnd"/>
             <w:r>
               <w:rPr>
                 <w:rFonts w:ascii="Calibri" w:hAnsi="Calibri" w:cs="Calibri"/>
@@ -7466,7 +8474,25 @@
                 <w:szCs w:val="22"/>
                 <w:lang w:val="en"/>
               </w:rPr>
-              <w:t>get =&gt; GetProperty&lt;</w:t>
+              <w:t xml:space="preserve">get =&gt; </w:t>
+            </w:r>
+            <w:proofErr w:type="spellStart"/>
+            <w:r>
+              <w:rPr>
+                <w:rFonts w:ascii="Calibri" w:hAnsi="Calibri" w:cs="Calibri"/>
+                <w:szCs w:val="22"/>
+                <w:lang w:val="en"/>
+              </w:rPr>
+              <w:t>GetProperty</w:t>
+            </w:r>
+            <w:proofErr w:type="spellEnd"/>
+            <w:r>
+              <w:rPr>
+                <w:rFonts w:ascii="Calibri" w:hAnsi="Calibri" w:cs="Calibri"/>
+                <w:szCs w:val="22"/>
+                <w:lang w:val="en"/>
+              </w:rPr>
+              <w:t>&lt;</w:t>
             </w:r>
             <w:r>
               <w:rPr>
@@ -7505,7 +8531,25 @@
                 <w:szCs w:val="22"/>
                 <w:lang w:val="en"/>
               </w:rPr>
-              <w:t>set =&gt; SetProperty(value);</w:t>
+              <w:t xml:space="preserve">set =&gt; </w:t>
+            </w:r>
+            <w:proofErr w:type="spellStart"/>
+            <w:r>
+              <w:rPr>
+                <w:rFonts w:ascii="Calibri" w:hAnsi="Calibri" w:cs="Calibri"/>
+                <w:szCs w:val="22"/>
+                <w:lang w:val="en"/>
+              </w:rPr>
+              <w:t>SetProperty</w:t>
+            </w:r>
+            <w:proofErr w:type="spellEnd"/>
+            <w:r>
+              <w:rPr>
+                <w:rFonts w:ascii="Calibri" w:hAnsi="Calibri" w:cs="Calibri"/>
+                <w:szCs w:val="22"/>
+                <w:lang w:val="en"/>
+              </w:rPr>
+              <w:t>(value);</w:t>
             </w:r>
           </w:p>
           <w:p>
@@ -7635,6 +8679,7 @@
               </w:rPr>
               <w:t xml:space="preserve"> from </w:t>
             </w:r>
+            <w:proofErr w:type="spellStart"/>
             <w:r>
               <w:rPr>
                 <w:rFonts w:ascii="Calibri" w:hAnsi="Calibri" w:cs="Calibri"/>
@@ -7645,6 +8690,7 @@
               </w:rPr>
               <w:t>xplat</w:t>
             </w:r>
+            <w:proofErr w:type="spellEnd"/>
             <w:r>
               <w:rPr>
                 <w:rFonts w:ascii="Calibri" w:hAnsi="Calibri" w:cs="Calibri"/>
@@ -7894,6 +8940,7 @@
               </w:rPr>
               <w:t xml:space="preserve">private void </w:t>
             </w:r>
+            <w:proofErr w:type="spellStart"/>
             <w:r>
               <w:rPr>
                 <w:rFonts w:ascii="Calibri" w:hAnsi="Calibri" w:cs="Calibri"/>
@@ -7903,13 +8950,32 @@
               </w:rPr>
               <w:t>MyMethod</w:t>
             </w:r>
-            <w:r>
-              <w:rPr>
-                <w:rFonts w:ascii="Calibri" w:hAnsi="Calibri" w:cs="Calibri"/>
-                <w:szCs w:val="22"/>
-                <w:lang w:val="en"/>
-              </w:rPr>
-              <w:t>(object sender, EventArgs e)</w:t>
+            <w:proofErr w:type="spellEnd"/>
+            <w:r>
+              <w:rPr>
+                <w:rFonts w:ascii="Calibri" w:hAnsi="Calibri" w:cs="Calibri"/>
+                <w:szCs w:val="22"/>
+                <w:lang w:val="en"/>
+              </w:rPr>
+              <w:t xml:space="preserve">(object sender, </w:t>
+            </w:r>
+            <w:proofErr w:type="spellStart"/>
+            <w:r>
+              <w:rPr>
+                <w:rFonts w:ascii="Calibri" w:hAnsi="Calibri" w:cs="Calibri"/>
+                <w:szCs w:val="22"/>
+                <w:lang w:val="en"/>
+              </w:rPr>
+              <w:t>EventArgs</w:t>
+            </w:r>
+            <w:proofErr w:type="spellEnd"/>
+            <w:r>
+              <w:rPr>
+                <w:rFonts w:ascii="Calibri" w:hAnsi="Calibri" w:cs="Calibri"/>
+                <w:szCs w:val="22"/>
+                <w:lang w:val="en"/>
+              </w:rPr>
+              <w:t xml:space="preserve"> e)</w:t>
             </w:r>
           </w:p>
           <w:p>
@@ -8068,6 +9134,7 @@
               </w:rPr>
               <w:t xml:space="preserve"> </w:t>
             </w:r>
+            <w:proofErr w:type="spellStart"/>
             <w:r>
               <w:rPr>
                 <w:rFonts w:ascii="Calibri" w:hAnsi="Calibri" w:cs="Calibri"/>
@@ -8077,6 +9144,7 @@
               </w:rPr>
               <w:t>MyMethod</w:t>
             </w:r>
+            <w:proofErr w:type="spellEnd"/>
             <w:r>
               <w:rPr>
                 <w:rFonts w:ascii="Calibri" w:hAnsi="Calibri" w:cs="Calibri"/>
@@ -8188,6 +9256,7 @@
                 <w:lang w:val="en"/>
               </w:rPr>
             </w:pPr>
+            <w:proofErr w:type="spellStart"/>
             <w:r>
               <w:rPr>
                 <w:rFonts w:ascii="Calibri" w:hAnsi="Calibri" w:cs="Calibri"/>
@@ -8198,6 +9267,7 @@
               </w:rPr>
               <w:t>amethod</w:t>
             </w:r>
+            <w:proofErr w:type="spellEnd"/>
           </w:p>
         </w:tc>
         <w:tc>
@@ -8231,7 +9301,25 @@
                 <w:szCs w:val="22"/>
                 <w:lang w:val="en"/>
               </w:rPr>
-              <w:t>async Task MyMethod()</w:t>
+              <w:t xml:space="preserve">async Task </w:t>
+            </w:r>
+            <w:proofErr w:type="spellStart"/>
+            <w:r>
+              <w:rPr>
+                <w:rFonts w:ascii="Calibri" w:hAnsi="Calibri" w:cs="Calibri"/>
+                <w:szCs w:val="22"/>
+                <w:lang w:val="en"/>
+              </w:rPr>
+              <w:t>MyMethod</w:t>
+            </w:r>
+            <w:proofErr w:type="spellEnd"/>
+            <w:r>
+              <w:rPr>
+                <w:rFonts w:ascii="Calibri" w:hAnsi="Calibri" w:cs="Calibri"/>
+                <w:szCs w:val="22"/>
+                <w:lang w:val="en"/>
+              </w:rPr>
+              <w:t>()</w:t>
             </w:r>
           </w:p>
           <w:p>
@@ -8408,6 +9496,7 @@
               </w:rPr>
               <w:t xml:space="preserve"> </w:t>
             </w:r>
+            <w:proofErr w:type="spellStart"/>
             <w:r>
               <w:rPr>
                 <w:rFonts w:ascii="Calibri" w:hAnsi="Calibri" w:cs="Calibri"/>
@@ -8417,6 +9506,7 @@
               </w:rPr>
               <w:t>MyRecord</w:t>
             </w:r>
+            <w:proofErr w:type="spellEnd"/>
           </w:p>
           <w:p>
             <w:pPr>
@@ -8548,6 +9638,7 @@
                 <w:lang w:val="en"/>
               </w:rPr>
             </w:pPr>
+            <w:proofErr w:type="spellStart"/>
             <w:r>
               <w:rPr>
                 <w:rFonts w:ascii="Calibri" w:hAnsi="Calibri" w:cs="Calibri"/>
@@ -8559,6 +9650,7 @@
               </w:rPr>
               <w:t>rstruct</w:t>
             </w:r>
+            <w:proofErr w:type="spellEnd"/>
           </w:p>
           <w:p>
             <w:pPr>
@@ -8584,6 +9676,7 @@
               </w:rPr>
               <w:t xml:space="preserve">(This has been updated to </w:t>
             </w:r>
+            <w:proofErr w:type="spellStart"/>
             <w:r>
               <w:rPr>
                 <w:rFonts w:ascii="Calibri" w:hAnsi="Calibri" w:cs="Calibri"/>
@@ -8594,6 +9687,7 @@
               </w:rPr>
               <w:t>rstruct</w:t>
             </w:r>
+            <w:proofErr w:type="spellEnd"/>
             <w:r>
               <w:rPr>
                 <w:rFonts w:ascii="Calibri" w:hAnsi="Calibri" w:cs="Calibri"/>
@@ -8602,6 +9696,7 @@
               </w:rPr>
               <w:t xml:space="preserve"> from </w:t>
             </w:r>
+            <w:proofErr w:type="spellStart"/>
             <w:r>
               <w:rPr>
                 <w:rFonts w:ascii="Calibri" w:hAnsi="Calibri" w:cs="Calibri"/>
@@ -8612,6 +9707,7 @@
               </w:rPr>
               <w:t>recstruct</w:t>
             </w:r>
+            <w:proofErr w:type="spellEnd"/>
             <w:r>
               <w:rPr>
                 <w:rFonts w:ascii="Calibri" w:hAnsi="Calibri" w:cs="Calibri"/>
@@ -8655,6 +9751,7 @@
               </w:rPr>
               <w:t xml:space="preserve"> struct </w:t>
             </w:r>
+            <w:proofErr w:type="spellStart"/>
             <w:r>
               <w:rPr>
                 <w:rFonts w:ascii="Calibri" w:hAnsi="Calibri" w:cs="Calibri"/>
@@ -8664,6 +9761,7 @@
               </w:rPr>
               <w:t>MyRecStruct</w:t>
             </w:r>
+            <w:proofErr w:type="spellEnd"/>
           </w:p>
           <w:p>
             <w:pPr>
@@ -8772,7 +9870,29 @@
                 <w:sz w:val="20"/>
                 <w:lang w:val="en"/>
               </w:rPr>
-              <w:t>(CommunityToolkit.Mvvm)</w:t>
+              <w:t>(</w:t>
+            </w:r>
+            <w:proofErr w:type="spellStart"/>
+            <w:r>
+              <w:rPr>
+                <w:rFonts w:ascii="Calibri" w:hAnsi="Calibri" w:cs="Calibri"/>
+                <w:i/>
+                <w:iCs/>
+                <w:sz w:val="20"/>
+                <w:lang w:val="en"/>
+              </w:rPr>
+              <w:t>CommunityToolkit.Mvvm</w:t>
+            </w:r>
+            <w:proofErr w:type="spellEnd"/>
+            <w:r>
+              <w:rPr>
+                <w:rFonts w:ascii="Calibri" w:hAnsi="Calibri" w:cs="Calibri"/>
+                <w:i/>
+                <w:iCs/>
+                <w:sz w:val="20"/>
+                <w:lang w:val="en"/>
+              </w:rPr>
+              <w:t>)</w:t>
             </w:r>
           </w:p>
         </w:tc>
@@ -8794,6 +9914,7 @@
                 <w:lang w:val="en"/>
               </w:rPr>
             </w:pPr>
+            <w:proofErr w:type="spellStart"/>
             <w:r>
               <w:rPr>
                 <w:rFonts w:ascii="Calibri" w:hAnsi="Calibri" w:cs="Calibri"/>
@@ -8810,6 +9931,7 @@
               </w:rPr>
               <w:t>op</w:t>
             </w:r>
+            <w:proofErr w:type="spellEnd"/>
           </w:p>
         </w:tc>
         <w:tc>
@@ -8835,7 +9957,25 @@
                 <w:szCs w:val="22"/>
                 <w:lang w:val="en"/>
               </w:rPr>
-              <w:t>[ObservableProperty]</w:t>
+              <w:t>[</w:t>
+            </w:r>
+            <w:proofErr w:type="spellStart"/>
+            <w:r>
+              <w:rPr>
+                <w:rFonts w:ascii="Calibri" w:hAnsi="Calibri" w:cs="Calibri"/>
+                <w:szCs w:val="22"/>
+                <w:lang w:val="en"/>
+              </w:rPr>
+              <w:t>ObservableProperty</w:t>
+            </w:r>
+            <w:proofErr w:type="spellEnd"/>
+            <w:r>
+              <w:rPr>
+                <w:rFonts w:ascii="Calibri" w:hAnsi="Calibri" w:cs="Calibri"/>
+                <w:szCs w:val="22"/>
+                <w:lang w:val="en"/>
+              </w:rPr>
+              <w:t>]</w:t>
             </w:r>
           </w:p>
           <w:p>
@@ -8950,7 +10090,29 @@
                 <w:sz w:val="20"/>
                 <w:lang w:val="en"/>
               </w:rPr>
-              <w:t>(CommunityToolkit.Mvvm)</w:t>
+              <w:t>(</w:t>
+            </w:r>
+            <w:proofErr w:type="spellStart"/>
+            <w:r>
+              <w:rPr>
+                <w:rFonts w:ascii="Calibri" w:hAnsi="Calibri" w:cs="Calibri"/>
+                <w:i/>
+                <w:iCs/>
+                <w:sz w:val="20"/>
+                <w:lang w:val="en"/>
+              </w:rPr>
+              <w:t>CommunityToolkit.Mvvm</w:t>
+            </w:r>
+            <w:proofErr w:type="spellEnd"/>
+            <w:r>
+              <w:rPr>
+                <w:rFonts w:ascii="Calibri" w:hAnsi="Calibri" w:cs="Calibri"/>
+                <w:i/>
+                <w:iCs/>
+                <w:sz w:val="20"/>
+                <w:lang w:val="en"/>
+              </w:rPr>
+              <w:t>)</w:t>
             </w:r>
           </w:p>
         </w:tc>
@@ -8972,6 +10134,7 @@
                 <w:lang w:val="en"/>
               </w:rPr>
             </w:pPr>
+            <w:proofErr w:type="spellStart"/>
             <w:r>
               <w:rPr>
                 <w:rFonts w:ascii="Calibri" w:hAnsi="Calibri" w:cs="Calibri"/>
@@ -8980,6 +10143,7 @@
               </w:rPr>
               <w:t>rcmd</w:t>
             </w:r>
+            <w:proofErr w:type="spellEnd"/>
           </w:p>
         </w:tc>
         <w:tc>
@@ -9005,7 +10169,25 @@
                 <w:szCs w:val="22"/>
                 <w:lang w:val="en"/>
               </w:rPr>
-              <w:t>[RelayCommand]</w:t>
+              <w:t>[</w:t>
+            </w:r>
+            <w:proofErr w:type="spellStart"/>
+            <w:r>
+              <w:rPr>
+                <w:rFonts w:ascii="Calibri" w:hAnsi="Calibri" w:cs="Calibri"/>
+                <w:szCs w:val="22"/>
+                <w:lang w:val="en"/>
+              </w:rPr>
+              <w:t>RelayCommand</w:t>
+            </w:r>
+            <w:proofErr w:type="spellEnd"/>
+            <w:r>
+              <w:rPr>
+                <w:rFonts w:ascii="Calibri" w:hAnsi="Calibri" w:cs="Calibri"/>
+                <w:szCs w:val="22"/>
+                <w:lang w:val="en"/>
+              </w:rPr>
+              <w:t>]</w:t>
             </w:r>
           </w:p>
           <w:p>
@@ -9162,7 +10344,29 @@
                 <w:sz w:val="20"/>
                 <w:lang w:val="en"/>
               </w:rPr>
-              <w:t>(CommunityToolkit.Mvvm)</w:t>
+              <w:t>(</w:t>
+            </w:r>
+            <w:proofErr w:type="spellStart"/>
+            <w:r>
+              <w:rPr>
+                <w:rFonts w:ascii="Calibri" w:hAnsi="Calibri" w:cs="Calibri"/>
+                <w:i/>
+                <w:iCs/>
+                <w:sz w:val="20"/>
+                <w:lang w:val="en"/>
+              </w:rPr>
+              <w:t>CommunityToolkit.Mvvm</w:t>
+            </w:r>
+            <w:proofErr w:type="spellEnd"/>
+            <w:r>
+              <w:rPr>
+                <w:rFonts w:ascii="Calibri" w:hAnsi="Calibri" w:cs="Calibri"/>
+                <w:i/>
+                <w:iCs/>
+                <w:sz w:val="20"/>
+                <w:lang w:val="en"/>
+              </w:rPr>
+              <w:t>)</w:t>
             </w:r>
           </w:p>
         </w:tc>
@@ -9184,6 +10388,7 @@
                 <w:lang w:val="en"/>
               </w:rPr>
             </w:pPr>
+            <w:proofErr w:type="spellStart"/>
             <w:r>
               <w:rPr>
                 <w:rFonts w:ascii="Calibri" w:hAnsi="Calibri" w:cs="Calibri"/>
@@ -9200,6 +10405,7 @@
               </w:rPr>
               <w:t>rcmd</w:t>
             </w:r>
+            <w:proofErr w:type="spellEnd"/>
           </w:p>
         </w:tc>
         <w:tc>
@@ -9225,7 +10431,25 @@
                 <w:szCs w:val="22"/>
                 <w:lang w:val="en"/>
               </w:rPr>
-              <w:t>[RelayCommand]</w:t>
+              <w:t>[</w:t>
+            </w:r>
+            <w:proofErr w:type="spellStart"/>
+            <w:r>
+              <w:rPr>
+                <w:rFonts w:ascii="Calibri" w:hAnsi="Calibri" w:cs="Calibri"/>
+                <w:szCs w:val="22"/>
+                <w:lang w:val="en"/>
+              </w:rPr>
+              <w:t>RelayCommand</w:t>
+            </w:r>
+            <w:proofErr w:type="spellEnd"/>
+            <w:r>
+              <w:rPr>
+                <w:rFonts w:ascii="Calibri" w:hAnsi="Calibri" w:cs="Calibri"/>
+                <w:szCs w:val="22"/>
+                <w:lang w:val="en"/>
+              </w:rPr>
+              <w:t>]</w:t>
             </w:r>
           </w:p>
           <w:p>
@@ -9257,6 +10481,7 @@
               </w:rPr>
               <w:t xml:space="preserve"> </w:t>
             </w:r>
+            <w:proofErr w:type="spellStart"/>
             <w:r>
               <w:rPr>
                 <w:rFonts w:ascii="Calibri" w:hAnsi="Calibri" w:cs="Calibri"/>
@@ -9274,6 +10499,7 @@
               </w:rPr>
               <w:t>Async</w:t>
             </w:r>
+            <w:proofErr w:type="spellEnd"/>
             <w:r>
               <w:rPr>
                 <w:rFonts w:ascii="Calibri" w:hAnsi="Calibri" w:cs="Calibri"/>
@@ -9379,6 +10605,7 @@
                 <w:lang w:val="en"/>
               </w:rPr>
             </w:pPr>
+            <w:proofErr w:type="spellStart"/>
             <w:r>
               <w:rPr>
                 <w:rFonts w:ascii="Calibri" w:hAnsi="Calibri" w:cs="Calibri"/>
@@ -9387,6 +10614,7 @@
               </w:rPr>
               <w:t>propvm</w:t>
             </w:r>
+            <w:proofErr w:type="spellEnd"/>
           </w:p>
         </w:tc>
         <w:tc>
@@ -9559,7 +10787,25 @@
                 <w:szCs w:val="22"/>
                 <w:lang w:val="en"/>
               </w:rPr>
-              <w:t xml:space="preserve">set =&gt; SetProperty(ref </w:t>
+              <w:t xml:space="preserve">set =&gt; </w:t>
+            </w:r>
+            <w:proofErr w:type="spellStart"/>
+            <w:r>
+              <w:rPr>
+                <w:rFonts w:ascii="Calibri" w:hAnsi="Calibri" w:cs="Calibri"/>
+                <w:szCs w:val="22"/>
+                <w:lang w:val="en"/>
+              </w:rPr>
+              <w:t>SetProperty</w:t>
+            </w:r>
+            <w:proofErr w:type="spellEnd"/>
+            <w:r>
+              <w:rPr>
+                <w:rFonts w:ascii="Calibri" w:hAnsi="Calibri" w:cs="Calibri"/>
+                <w:szCs w:val="22"/>
+                <w:lang w:val="en"/>
+              </w:rPr>
+              <w:t xml:space="preserve">(ref </w:t>
             </w:r>
             <w:r>
               <w:rPr>
@@ -9653,6 +10899,7 @@
                 <w:lang w:val="en"/>
               </w:rPr>
             </w:pPr>
+            <w:proofErr w:type="spellStart"/>
             <w:r>
               <w:rPr>
                 <w:rFonts w:ascii="Calibri" w:hAnsi="Calibri" w:cs="Calibri"/>
@@ -9661,6 +10908,7 @@
               </w:rPr>
               <w:t>cmem</w:t>
             </w:r>
+            <w:proofErr w:type="spellEnd"/>
           </w:p>
         </w:tc>
         <w:tc>
@@ -9688,6 +10936,7 @@
               </w:rPr>
               <w:t xml:space="preserve">public static </w:t>
             </w:r>
+            <w:proofErr w:type="spellStart"/>
             <w:r>
               <w:rPr>
                 <w:rFonts w:ascii="Calibri" w:hAnsi="Calibri" w:cs="Calibri"/>
@@ -9697,6 +10946,7 @@
               </w:rPr>
               <w:t>TBindable</w:t>
             </w:r>
+            <w:proofErr w:type="spellEnd"/>
             <w:r>
               <w:rPr>
                 <w:rFonts w:ascii="Calibri" w:hAnsi="Calibri" w:cs="Calibri"/>
@@ -9705,6 +10955,7 @@
               </w:rPr>
               <w:t xml:space="preserve"> </w:t>
             </w:r>
+            <w:proofErr w:type="spellStart"/>
             <w:r>
               <w:rPr>
                 <w:rFonts w:ascii="Calibri" w:hAnsi="Calibri" w:cs="Calibri"/>
@@ -9714,6 +10965,7 @@
               </w:rPr>
               <w:t>MyMethod</w:t>
             </w:r>
+            <w:proofErr w:type="spellEnd"/>
             <w:r>
               <w:rPr>
                 <w:rFonts w:ascii="Calibri" w:hAnsi="Calibri" w:cs="Calibri"/>
@@ -9722,6 +10974,7 @@
               </w:rPr>
               <w:t>&lt;</w:t>
             </w:r>
+            <w:proofErr w:type="spellStart"/>
             <w:r>
               <w:rPr>
                 <w:rFonts w:ascii="Calibri" w:hAnsi="Calibri" w:cs="Calibri"/>
@@ -9731,6 +10984,7 @@
               </w:rPr>
               <w:t>TBindable</w:t>
             </w:r>
+            <w:proofErr w:type="spellEnd"/>
             <w:r>
               <w:rPr>
                 <w:rFonts w:ascii="Calibri" w:hAnsi="Calibri" w:cs="Calibri"/>
@@ -9739,6 +10993,7 @@
               </w:rPr>
               <w:t xml:space="preserve">&gt;(this </w:t>
             </w:r>
+            <w:proofErr w:type="spellStart"/>
             <w:r>
               <w:rPr>
                 <w:rFonts w:ascii="Calibri" w:hAnsi="Calibri" w:cs="Calibri"/>
@@ -9748,6 +11003,7 @@
               </w:rPr>
               <w:t>TBindable</w:t>
             </w:r>
+            <w:proofErr w:type="spellEnd"/>
             <w:r>
               <w:rPr>
                 <w:rFonts w:ascii="Calibri" w:hAnsi="Calibri" w:cs="Calibri"/>
@@ -9773,6 +11029,7 @@
               </w:rPr>
               <w:t xml:space="preserve">) where </w:t>
             </w:r>
+            <w:proofErr w:type="spellStart"/>
             <w:r>
               <w:rPr>
                 <w:rFonts w:ascii="Calibri" w:hAnsi="Calibri" w:cs="Calibri"/>
@@ -9782,6 +11039,7 @@
               </w:rPr>
               <w:t>TBindable</w:t>
             </w:r>
+            <w:proofErr w:type="spellEnd"/>
             <w:r>
               <w:rPr>
                 <w:rFonts w:ascii="Calibri" w:hAnsi="Calibri" w:cs="Calibri"/>
@@ -9790,6 +11048,7 @@
               </w:rPr>
               <w:t xml:space="preserve"> : </w:t>
             </w:r>
+            <w:proofErr w:type="spellStart"/>
             <w:r>
               <w:rPr>
                 <w:rFonts w:ascii="Calibri" w:hAnsi="Calibri" w:cs="Calibri"/>
@@ -9799,6 +11058,7 @@
               </w:rPr>
               <w:t>BindableObject</w:t>
             </w:r>
+            <w:proofErr w:type="spellEnd"/>
           </w:p>
           <w:p>
             <w:pPr>
@@ -9932,7 +11192,7 @@
           <w:lang w:val="en"/>
         </w:rPr>
       </w:pPr>
-      <w:bookmarkStart w:id="6" w:name="_Toc215221709"/>
+      <w:bookmarkStart w:id="6" w:name="_Toc225346383"/>
       <w:r>
         <w:rPr>
           <w:lang w:val="en"/>
@@ -10029,7 +11289,55 @@
           <w:szCs w:val="22"/>
           <w:lang w:val="en"/>
         </w:rPr>
-        <w:t xml:space="preserve"> (v18.0 or later), as long as the .NET MAUI workload is installed. It works with .NET MAUI versions 8, 9, and 10 on both </w:t>
+        <w:t xml:space="preserve"> (v18.0 or later), as long as the .NET MAUI workload is installed. It works with .NET MAUI versions </w:t>
+      </w:r>
+      <w:r>
+        <w:rPr>
+          <w:rFonts w:ascii="Calibri" w:hAnsi="Calibri" w:cs="Calibri"/>
+          <w:szCs w:val="22"/>
+          <w:lang w:val="en"/>
+        </w:rPr>
+        <w:t>9</w:t>
+      </w:r>
+      <w:r>
+        <w:rPr>
+          <w:rFonts w:ascii="Calibri" w:hAnsi="Calibri" w:cs="Calibri"/>
+          <w:szCs w:val="22"/>
+          <w:lang w:val="en"/>
+        </w:rPr>
+        <w:t xml:space="preserve">, </w:t>
+      </w:r>
+      <w:r>
+        <w:rPr>
+          <w:rFonts w:ascii="Calibri" w:hAnsi="Calibri" w:cs="Calibri"/>
+          <w:szCs w:val="22"/>
+          <w:lang w:val="en"/>
+        </w:rPr>
+        <w:t>10</w:t>
+      </w:r>
+      <w:r>
+        <w:rPr>
+          <w:rFonts w:ascii="Calibri" w:hAnsi="Calibri" w:cs="Calibri"/>
+          <w:szCs w:val="22"/>
+          <w:lang w:val="en"/>
+        </w:rPr>
+        <w:t>, and 1</w:t>
+      </w:r>
+      <w:r>
+        <w:rPr>
+          <w:rFonts w:ascii="Calibri" w:hAnsi="Calibri" w:cs="Calibri"/>
+          <w:szCs w:val="22"/>
+          <w:lang w:val="en"/>
+        </w:rPr>
+        <w:t>1 (Preview)</w:t>
+      </w:r>
+      <w:r>
+        <w:rPr>
+          <w:rFonts w:ascii="Calibri" w:hAnsi="Calibri" w:cs="Calibri"/>
+          <w:szCs w:val="22"/>
+          <w:lang w:val="en"/>
+        </w:rPr>
+        <w:t xml:space="preserve"> on both </w:t>
       </w:r>
       <w:r>
         <w:rPr>

</xml_diff>